<commit_message>
finished embedded systems lab 1
</commit_message>
<xml_diff>
--- a/Fall-2026/embedded-systems/labs/Lab1_ESP32_GPIO_JOSIAH_SCHMITZ.docx
+++ b/Fall-2026/embedded-systems/labs/Lab1_ESP32_GPIO_JOSIAH_SCHMITZ.docx
@@ -1,24 +1,22 @@
 
 <file path=word/document.xml><?xml version="1.0" encoding="utf-8"?>
-<w:document xmlns:o="urn:schemas-microsoft-com:office:office" xmlns:r="http://schemas.openxmlformats.org/officeDocument/2006/relationships" xmlns:v="urn:schemas-microsoft-com:vml" xmlns:w="http://schemas.openxmlformats.org/wordprocessingml/2006/main" xmlns:w10="urn:schemas-microsoft-com:office:word" xmlns:wp="http://schemas.openxmlformats.org/drawingml/2006/wordprocessingDrawing" xmlns:wps="http://schemas.microsoft.com/office/word/2010/wordprocessingShape" xmlns:wpg="http://schemas.microsoft.com/office/word/2010/wordprocessingGroup" xmlns:mc="http://schemas.openxmlformats.org/markup-compatibility/2006" xmlns:wp14="http://schemas.microsoft.com/office/word/2010/wordprocessingDrawing" xmlns:w14="http://schemas.microsoft.com/office/word/2010/wordml" xmlns:w15="http://schemas.microsoft.com/office/word/2012/wordml" mc:Ignorable="w14 wp14 w15">
+<w:document xmlns:wpc="http://schemas.microsoft.com/office/word/2010/wordprocessingCanvas" xmlns:cx="http://schemas.microsoft.com/office/drawing/2014/chartex" xmlns:cx1="http://schemas.microsoft.com/office/drawing/2015/9/8/chartex" xmlns:cx2="http://schemas.microsoft.com/office/drawing/2015/10/21/chartex" xmlns:cx3="http://schemas.microsoft.com/office/drawing/2016/5/9/chartex" xmlns:cx4="http://schemas.microsoft.com/office/drawing/2016/5/10/chartex" xmlns:cx5="http://schemas.microsoft.com/office/drawing/2016/5/11/chartex" xmlns:cx6="http://schemas.microsoft.com/office/drawing/2016/5/12/chartex" xmlns:cx7="http://schemas.microsoft.com/office/drawing/2016/5/13/chartex" xmlns:cx8="http://schemas.microsoft.com/office/drawing/2016/5/14/chartex" xmlns:mc="http://schemas.openxmlformats.org/markup-compatibility/2006" xmlns:aink="http://schemas.microsoft.com/office/drawing/2016/ink" xmlns:am3d="http://schemas.microsoft.com/office/drawing/2017/model3d" xmlns:o="urn:schemas-microsoft-com:office:office" xmlns:oel="http://schemas.microsoft.com/office/2019/extlst" xmlns:r="http://schemas.openxmlformats.org/officeDocument/2006/relationships" xmlns:m="http://schemas.openxmlformats.org/officeDocument/2006/math" xmlns:v="urn:schemas-microsoft-com:vml" xmlns:wp14="http://schemas.microsoft.com/office/word/2010/wordprocessingDrawing" xmlns:wp="http://schemas.openxmlformats.org/drawingml/2006/wordprocessingDrawing" xmlns:w10="urn:schemas-microsoft-com:office:word" xmlns:w="http://schemas.openxmlformats.org/wordprocessingml/2006/main" xmlns:w14="http://schemas.microsoft.com/office/word/2010/wordml" xmlns:w15="http://schemas.microsoft.com/office/word/2012/wordml" xmlns:w16cex="http://schemas.microsoft.com/office/word/2018/wordml/cex" xmlns:w16cid="http://schemas.microsoft.com/office/word/2016/wordml/cid" xmlns:w16="http://schemas.microsoft.com/office/word/2018/wordml" xmlns:w16du="http://schemas.microsoft.com/office/word/2023/wordml/word16du" xmlns:w16sdtdh="http://schemas.microsoft.com/office/word/2020/wordml/sdtdatahash" xmlns:w16sdtfl="http://schemas.microsoft.com/office/word/2024/wordml/sdtformatlock" xmlns:w16se="http://schemas.microsoft.com/office/word/2015/wordml/symex" xmlns:wpg="http://schemas.microsoft.com/office/word/2010/wordprocessingGroup" xmlns:wpi="http://schemas.microsoft.com/office/word/2010/wordprocessingInk" xmlns:wne="http://schemas.microsoft.com/office/word/2006/wordml" xmlns:wps="http://schemas.microsoft.com/office/word/2010/wordprocessingShape" mc:Ignorable="w14 w15 w16se w16cid w16 w16cex w16sdtdh w16sdtfl w16du wp14">
   <w:body>
     <w:p>
       <w:pPr>
         <w:pStyle w:val="Heading1"/>
-        <w:spacing w:before="19" w:after="0"/>
-        <w:ind w:hanging="0" w:left="5" w:right="0"/>
-        <w:jc w:val="left"/>
-        <w:rPr>
-          <w:b w:val="false"/>
-          <w:bCs w:val="false"/>
+        <w:ind w:left="5" w:firstLine="0"/>
+        <w:rPr>
+          <w:b w:val="0"/>
+          <w:bCs w:val="0"/>
           <w:spacing w:val="-2"/>
           <w:sz w:val="22"/>
         </w:rPr>
       </w:pPr>
       <w:r>
         <w:rPr>
-          <w:b w:val="false"/>
-          <w:bCs w:val="false"/>
+          <w:b w:val="0"/>
+          <w:bCs w:val="0"/>
           <w:spacing w:val="-2"/>
           <w:sz w:val="22"/>
         </w:rPr>
@@ -28,7 +26,7 @@
     <w:p>
       <w:pPr>
         <w:pStyle w:val="Heading1"/>
-        <w:ind w:hanging="0" w:left="5" w:right="0"/>
+        <w:ind w:left="5" w:firstLine="0"/>
         <w:jc w:val="center"/>
         <w:rPr>
           <w:spacing w:val="-2"/>
@@ -46,55 +44,470 @@
     <w:p>
       <w:pPr>
         <w:pStyle w:val="Heading1"/>
-        <w:ind w:hanging="0" w:left="5" w:right="0"/>
+        <w:ind w:left="5" w:firstLine="0"/>
         <w:jc w:val="center"/>
         <w:rPr>
           <w:spacing w:val="-2"/>
           <w:sz w:val="22"/>
         </w:rPr>
       </w:pPr>
-      <w:r>
-        <w:rPr>
-          <w:spacing w:val="-2"/>
-          <w:sz w:val="22"/>
-        </w:rPr>
-      </w:r>
     </w:p>
     <w:p>
       <w:pPr>
         <w:pStyle w:val="Heading1"/>
-        <w:ind w:hanging="0" w:left="5" w:right="0"/>
-        <w:jc w:val="left"/>
-        <w:rPr>
-          <w:b w:val="false"/>
-          <w:bCs w:val="false"/>
+        <w:ind w:left="5" w:firstLine="0"/>
+        <w:rPr>
+          <w:b w:val="0"/>
+          <w:bCs w:val="0"/>
           <w:spacing w:val="-2"/>
           <w:sz w:val="22"/>
-        </w:rPr>
-      </w:pPr>
-      <w:r>
-        <w:rPr>
-          <w:b w:val="false"/>
-          <w:bCs w:val="false"/>
+          <w:u w:val="single"/>
+        </w:rPr>
+      </w:pPr>
+      <w:r>
+        <w:rPr>
+          <w:b w:val="0"/>
+          <w:bCs w:val="0"/>
           <w:spacing w:val="-2"/>
           <w:sz w:val="22"/>
-        </w:rPr>
-        <w:t>Question 6.4 – Gray code keeps rotary position sensors from missing values when reading discs. If a disc is read when it’s positioned between two values, the sensor will read the data improperly. It may read the previous value twice or end up returning an incorrect value.</w:t>
+          <w:u w:val="single"/>
+        </w:rPr>
+        <w:t>Results</w:t>
       </w:r>
     </w:p>
     <w:p>
       <w:pPr>
+        <w:pStyle w:val="Heading1"/>
+        <w:ind w:left="0" w:firstLine="0"/>
+        <w:rPr>
+          <w:b w:val="0"/>
+          <w:bCs w:val="0"/>
+          <w:spacing w:val="-2"/>
+          <w:sz w:val="22"/>
+        </w:rPr>
+      </w:pPr>
+    </w:p>
+    <w:p>
+      <w:pPr>
+        <w:pStyle w:val="Heading1"/>
+        <w:ind w:left="5" w:firstLine="0"/>
+        <w:rPr>
+          <w:b w:val="0"/>
+          <w:bCs w:val="0"/>
+          <w:spacing w:val="-2"/>
+          <w:sz w:val="22"/>
+        </w:rPr>
+      </w:pPr>
+      <w:r>
+        <w:rPr>
+          <w:b w:val="0"/>
+          <w:bCs w:val="0"/>
+          <w:spacing w:val="-2"/>
+          <w:sz w:val="22"/>
+        </w:rPr>
+        <w:t xml:space="preserve">Experiment </w:t>
+      </w:r>
+      <w:r>
+        <w:rPr>
+          <w:b w:val="0"/>
+          <w:bCs w:val="0"/>
+          <w:spacing w:val="-2"/>
+          <w:sz w:val="22"/>
+        </w:rPr>
+        <w:t>1</w:t>
+      </w:r>
+      <w:r>
+        <w:rPr>
+          <w:b w:val="0"/>
+          <w:bCs w:val="0"/>
+          <w:spacing w:val="-2"/>
+          <w:sz w:val="22"/>
+        </w:rPr>
+        <w:t>: Experiment was successful. When running listing 3.1, D0 blinks on and off every half-second forever. However, when the while loop is removed, it only blinks on and off once total.</w:t>
+      </w:r>
+    </w:p>
+    <w:p>
+      <w:pPr>
+        <w:pStyle w:val="Heading1"/>
+        <w:ind w:left="5" w:firstLine="0"/>
+        <w:rPr>
+          <w:b w:val="0"/>
+          <w:bCs w:val="0"/>
+          <w:spacing w:val="-2"/>
+          <w:sz w:val="22"/>
+        </w:rPr>
+      </w:pPr>
+    </w:p>
+    <w:p>
+      <w:pPr>
+        <w:pStyle w:val="Heading1"/>
+        <w:ind w:left="5" w:firstLine="0"/>
+        <w:rPr>
+          <w:b w:val="0"/>
+          <w:bCs w:val="0"/>
+          <w:spacing w:val="-2"/>
+          <w:sz w:val="22"/>
+        </w:rPr>
+      </w:pPr>
+      <w:r>
+        <w:rPr>
+          <w:b w:val="0"/>
+          <w:bCs w:val="0"/>
+          <w:spacing w:val="-2"/>
+          <w:sz w:val="22"/>
+        </w:rPr>
+        <w:t xml:space="preserve">Experiment </w:t>
+      </w:r>
+      <w:r>
+        <w:rPr>
+          <w:b w:val="0"/>
+          <w:bCs w:val="0"/>
+          <w:spacing w:val="-2"/>
+          <w:sz w:val="22"/>
+        </w:rPr>
+        <w:t>2</w:t>
+      </w:r>
+      <w:r>
+        <w:rPr>
+          <w:b w:val="0"/>
+          <w:bCs w:val="0"/>
+          <w:spacing w:val="-2"/>
+          <w:sz w:val="22"/>
+        </w:rPr>
+        <w:t>: Experiment was successful. When running listing 4.1, the LEDs blink in a pattern matching a binary counter increasing to 255 before resetting. The output in the console matches this. When changing uint8_t count to int8_t count, the output instead cycles back to -128 after passing 127 because count is now a signed integer.</w:t>
+      </w:r>
+    </w:p>
+    <w:p>
+      <w:pPr>
+        <w:pStyle w:val="Heading1"/>
+        <w:ind w:left="5" w:firstLine="0"/>
+        <w:rPr>
+          <w:b w:val="0"/>
+          <w:bCs w:val="0"/>
+          <w:spacing w:val="-2"/>
+          <w:sz w:val="22"/>
+        </w:rPr>
+      </w:pPr>
+    </w:p>
+    <w:p>
+      <w:pPr>
+        <w:pStyle w:val="Heading1"/>
+        <w:ind w:left="5" w:firstLine="0"/>
+        <w:rPr>
+          <w:b w:val="0"/>
+          <w:bCs w:val="0"/>
+          <w:spacing w:val="-2"/>
+          <w:sz w:val="22"/>
+        </w:rPr>
+      </w:pPr>
+      <w:r>
+        <w:rPr>
+          <w:b w:val="0"/>
+          <w:bCs w:val="0"/>
+          <w:spacing w:val="-2"/>
+          <w:sz w:val="22"/>
+        </w:rPr>
+        <w:t xml:space="preserve">Experiment </w:t>
+      </w:r>
+      <w:r>
+        <w:rPr>
+          <w:b w:val="0"/>
+          <w:bCs w:val="0"/>
+          <w:spacing w:val="-2"/>
+          <w:sz w:val="22"/>
+        </w:rPr>
+        <w:t>3</w:t>
+      </w:r>
+      <w:r>
+        <w:rPr>
+          <w:b w:val="0"/>
+          <w:bCs w:val="0"/>
+          <w:spacing w:val="-2"/>
+          <w:sz w:val="22"/>
+        </w:rPr>
+        <w:t xml:space="preserve">: </w:t>
+      </w:r>
+      <w:r>
+        <w:rPr>
+          <w:b w:val="0"/>
+          <w:bCs w:val="0"/>
+          <w:spacing w:val="-2"/>
+          <w:sz w:val="22"/>
+        </w:rPr>
+        <w:t>Experiment was successful. Each solution I came up with for the various methods worked and caused all the tests to pass. They also ended up matching the given code in 5.11.</w:t>
+      </w:r>
+    </w:p>
+    <w:p>
+      <w:pPr>
+        <w:pStyle w:val="Heading1"/>
+        <w:ind w:left="5" w:firstLine="0"/>
+        <w:rPr>
+          <w:b w:val="0"/>
+          <w:bCs w:val="0"/>
+          <w:spacing w:val="-2"/>
+          <w:sz w:val="22"/>
+        </w:rPr>
+      </w:pPr>
+    </w:p>
+    <w:p>
+      <w:pPr>
+        <w:pStyle w:val="Heading1"/>
+        <w:ind w:left="5" w:firstLine="0"/>
+        <w:rPr>
+          <w:b w:val="0"/>
+          <w:bCs w:val="0"/>
+          <w:spacing w:val="-2"/>
+          <w:sz w:val="22"/>
+        </w:rPr>
+      </w:pPr>
+      <w:r>
+        <w:rPr>
+          <w:b w:val="0"/>
+          <w:bCs w:val="0"/>
+          <w:spacing w:val="-2"/>
+          <w:sz w:val="22"/>
+        </w:rPr>
+        <w:t xml:space="preserve">Experiment 4: Experiment was successful. </w:t>
+      </w:r>
+      <w:r>
+        <w:rPr>
+          <w:b w:val="0"/>
+          <w:bCs w:val="0"/>
+          <w:spacing w:val="-2"/>
+          <w:sz w:val="22"/>
+        </w:rPr>
+        <w:t>The counter still functioned, but this time only one LED changed at a time, maintaining the gray code approach</w:t>
+      </w:r>
+      <w:r>
+        <w:rPr>
+          <w:b w:val="0"/>
+          <w:bCs w:val="0"/>
+          <w:spacing w:val="-2"/>
+          <w:sz w:val="22"/>
+        </w:rPr>
+        <w:t>.</w:t>
+      </w:r>
+    </w:p>
+    <w:p>
+      <w:pPr>
+        <w:pStyle w:val="Heading1"/>
+        <w:ind w:left="5" w:firstLine="0"/>
+        <w:rPr>
+          <w:b w:val="0"/>
+          <w:bCs w:val="0"/>
+          <w:spacing w:val="-2"/>
+          <w:sz w:val="22"/>
+        </w:rPr>
+      </w:pPr>
+    </w:p>
+    <w:p>
+      <w:pPr>
+        <w:pStyle w:val="Heading1"/>
+        <w:ind w:left="5" w:firstLine="0"/>
+        <w:rPr>
+          <w:b w:val="0"/>
+          <w:bCs w:val="0"/>
+          <w:spacing w:val="-2"/>
+          <w:sz w:val="22"/>
+        </w:rPr>
+      </w:pPr>
+      <w:r>
+        <w:rPr>
+          <w:b w:val="0"/>
+          <w:bCs w:val="0"/>
+          <w:spacing w:val="-2"/>
+          <w:sz w:val="22"/>
+        </w:rPr>
+        <w:t xml:space="preserve">Experiment 5: </w:t>
+      </w:r>
+      <w:r>
+        <w:rPr>
+          <w:b w:val="0"/>
+          <w:bCs w:val="0"/>
+          <w:spacing w:val="-2"/>
+          <w:sz w:val="22"/>
+        </w:rPr>
+        <w:t>Experiment was successful. Made slight error by testing if v == 0x00 instead of 0x01, but now the lights cycle around for 3 cycles before it starts flipping back and forth for 3 cycles.</w:t>
+      </w:r>
+    </w:p>
+    <w:p>
+      <w:pPr>
+        <w:pStyle w:val="Heading1"/>
+        <w:ind w:left="5" w:firstLine="0"/>
+        <w:rPr>
+          <w:b w:val="0"/>
+          <w:bCs w:val="0"/>
+          <w:spacing w:val="-2"/>
+          <w:sz w:val="22"/>
+        </w:rPr>
+      </w:pPr>
+    </w:p>
+    <w:p>
+      <w:pPr>
+        <w:pStyle w:val="Heading1"/>
+        <w:ind w:left="5" w:firstLine="0"/>
+        <w:rPr>
+          <w:b w:val="0"/>
+          <w:bCs w:val="0"/>
+          <w:spacing w:val="-2"/>
+          <w:sz w:val="22"/>
+        </w:rPr>
+      </w:pPr>
+      <w:r>
+        <w:rPr>
+          <w:b w:val="0"/>
+          <w:bCs w:val="0"/>
+          <w:spacing w:val="-2"/>
+          <w:sz w:val="22"/>
+        </w:rPr>
+        <w:t xml:space="preserve">Question 6.4 </w:t>
+      </w:r>
+      <w:r>
+        <w:rPr>
+          <w:b w:val="0"/>
+          <w:bCs w:val="0"/>
+          <w:spacing w:val="-2"/>
+          <w:sz w:val="22"/>
+        </w:rPr>
+        <w:t xml:space="preserve">Answer </w:t>
+      </w:r>
+      <w:r>
+        <w:rPr>
+          <w:b w:val="0"/>
+          <w:bCs w:val="0"/>
+          <w:spacing w:val="-2"/>
+          <w:sz w:val="22"/>
+        </w:rPr>
+        <w:t>– Gray code keeps rotary position sensors from missing values when reading discs. If a disc is read when it’s positioned between two values, the sensor will read the data improperly. It may read the previous value twice or end up returning an incorrect value.</w:t>
+      </w:r>
+    </w:p>
+    <w:p>
+      <w:pPr>
+        <w:pStyle w:val="Heading1"/>
+        <w:ind w:left="5" w:firstLine="0"/>
+        <w:rPr>
+          <w:b w:val="0"/>
+          <w:bCs w:val="0"/>
+          <w:spacing w:val="-2"/>
+          <w:sz w:val="22"/>
+        </w:rPr>
+      </w:pPr>
+    </w:p>
+    <w:p>
+      <w:pPr>
+        <w:pStyle w:val="Heading1"/>
+        <w:ind w:left="5" w:firstLine="0"/>
+        <w:rPr>
+          <w:b w:val="0"/>
+          <w:bCs w:val="0"/>
+          <w:spacing w:val="-2"/>
+          <w:sz w:val="22"/>
+        </w:rPr>
+      </w:pPr>
+      <w:r>
+        <w:rPr>
+          <w:b w:val="0"/>
+          <w:bCs w:val="0"/>
+          <w:spacing w:val="-2"/>
+          <w:sz w:val="22"/>
+        </w:rPr>
+        <w:t xml:space="preserve">Wokwi Project Link: </w:t>
+      </w:r>
+      <w:r>
+        <w:rPr>
+          <w:b w:val="0"/>
+          <w:bCs w:val="0"/>
+          <w:spacing w:val="-2"/>
+          <w:sz w:val="22"/>
+        </w:rPr>
+        <w:t>https://wokwi.com/projects/473522856658328577</w:t>
+      </w:r>
+    </w:p>
+    <w:p>
+      <w:pPr>
+        <w:pStyle w:val="Heading1"/>
+        <w:ind w:left="0" w:firstLine="0"/>
+        <w:rPr>
+          <w:b w:val="0"/>
+          <w:bCs w:val="0"/>
+          <w:spacing w:val="-2"/>
+          <w:sz w:val="22"/>
+        </w:rPr>
+      </w:pPr>
+    </w:p>
+    <w:p>
+      <w:r>
+        <w:rPr>
+          <w:b/>
+          <w:bCs/>
+          <w:noProof/>
+          <w:spacing w:val="-2"/>
+        </w:rPr>
+        <w:drawing>
+          <wp:inline distT="0" distB="0" distL="0" distR="0" wp14:anchorId="2AFE5720" wp14:editId="722B3642">
+            <wp:extent cx="6400800" cy="3191510"/>
+            <wp:effectExtent l="0" t="0" r="0" b="0"/>
+            <wp:docPr id="128569551" name="Picture 3"/>
+            <wp:cNvGraphicFramePr>
+              <a:graphicFrameLocks xmlns:a="http://schemas.openxmlformats.org/drawingml/2006/main" noChangeAspect="1"/>
+            </wp:cNvGraphicFramePr>
+            <a:graphic xmlns:a="http://schemas.openxmlformats.org/drawingml/2006/main">
+              <a:graphicData uri="http://schemas.openxmlformats.org/drawingml/2006/picture">
+                <pic:pic xmlns:pic="http://schemas.openxmlformats.org/drawingml/2006/picture">
+                  <pic:nvPicPr>
+                    <pic:cNvPr id="0" name="Picture 1"/>
+                    <pic:cNvPicPr>
+                      <a:picLocks noChangeAspect="1" noChangeArrowheads="1"/>
+                    </pic:cNvPicPr>
+                  </pic:nvPicPr>
+                  <pic:blipFill>
+                    <a:blip r:embed="rId7" cstate="print">
+                      <a:extLst>
+                        <a:ext uri="{28A0092B-C50C-407E-A947-70E740481C1C}">
+                          <a14:useLocalDpi xmlns:a14="http://schemas.microsoft.com/office/drawing/2010/main" val="0"/>
+                        </a:ext>
+                      </a:extLst>
+                    </a:blip>
+                    <a:srcRect/>
+                    <a:stretch>
+                      <a:fillRect/>
+                    </a:stretch>
+                  </pic:blipFill>
+                  <pic:spPr bwMode="auto">
+                    <a:xfrm>
+                      <a:off x="0" y="0"/>
+                      <a:ext cx="6400800" cy="3191510"/>
+                    </a:xfrm>
+                    <a:prstGeom prst="rect">
+                      <a:avLst/>
+                    </a:prstGeom>
+                    <a:noFill/>
+                    <a:ln>
+                      <a:noFill/>
+                    </a:ln>
+                  </pic:spPr>
+                </pic:pic>
+              </a:graphicData>
+            </a:graphic>
+          </wp:inline>
+        </w:drawing>
+      </w:r>
+    </w:p>
+    <w:p>
+      <w:pPr>
+        <w:jc w:val="center"/>
         <w:sectPr>
-          <w:footerReference w:type="default" r:id="rId2"/>
-          <w:type w:val="nextPage"/>
+          <w:footerReference w:type="default" r:id="rId8"/>
           <w:pgSz w:w="12240" w:h="15840"/>
-          <w:pgMar w:left="1080" w:right="1080" w:gutter="0" w:header="0" w:top="1280" w:footer="718" w:bottom="901"/>
-          <w:pgNumType w:fmt="decimal"/>
-          <w:formProt w:val="false"/>
-          <w:textDirection w:val="lrTb"/>
-          <w:docGrid w:type="default" w:linePitch="312" w:charSpace="4294965247"/>
+          <w:pgMar w:top="1280" w:right="1080" w:bottom="901" w:left="1080" w:header="0" w:footer="718" w:gutter="0"/>
+          <w:cols w:space="720"/>
+          <w:formProt w:val="0"/>
+          <w:docGrid w:linePitch="312" w:charSpace="-2049"/>
         </w:sectPr>
       </w:pPr>
+      <w:r>
+        <w:t>Test Output</w:t>
+      </w:r>
     </w:p>
     <w:p>
       <w:pPr>
@@ -104,18 +517,14 @@
           <w:numId w:val="2"/>
         </w:numPr>
         <w:tabs>
-          <w:tab w:val="clear" w:pos="720"/>
-          <w:tab w:val="left" w:pos="638" w:leader="none"/>
+          <w:tab w:val="left" w:pos="638"/>
         </w:tabs>
-        <w:spacing w:lineRule="auto" w:line="240" w:before="19" w:after="0"/>
-        <w:ind w:hanging="418" w:left="638" w:right="0"/>
-        <w:jc w:val="left"/>
-        <w:rPr/>
+        <w:ind w:left="638" w:hanging="418"/>
       </w:pPr>
       <w:bookmarkStart w:id="0" w:name="11._Results_to_Record"/>
       <w:bookmarkEnd w:id="0"/>
       <w:r>
-        <w:rPr/>
+        <w:lastRenderedPageBreak/>
         <w:t>Results</w:t>
       </w:r>
       <w:r>
@@ -125,7 +534,6 @@
         <w:t xml:space="preserve"> </w:t>
       </w:r>
       <w:r>
-        <w:rPr/>
         <w:t>to</w:t>
       </w:r>
       <w:r>
@@ -143,10 +551,8 @@
     </w:p>
     <w:p>
       <w:pPr>
-        <w:pStyle w:val="Normal"/>
-        <w:spacing w:before="129" w:after="0"/>
-        <w:ind w:hanging="0" w:left="220" w:right="0"/>
-        <w:jc w:val="left"/>
+        <w:spacing w:before="129"/>
+        <w:ind w:left="220"/>
         <w:rPr>
           <w:b/>
           <w:sz w:val="20"/>
@@ -216,31 +622,23 @@
     <w:p>
       <w:pPr>
         <w:pStyle w:val="BodyText"/>
-        <w:spacing w:before="10" w:after="0"/>
+        <w:spacing w:before="10"/>
         <w:rPr>
           <w:b/>
           <w:sz w:val="5"/>
         </w:rPr>
       </w:pPr>
-      <w:r>
-        <w:rPr>
-          <w:b/>
-          <w:sz w:val="5"/>
-        </w:rPr>
-      </w:r>
     </w:p>
     <w:tbl>
       <w:tblPr>
         <w:tblW w:w="9365" w:type="dxa"/>
-        <w:jc w:val="left"/>
         <w:tblInd w:w="220" w:type="dxa"/>
         <w:tblLayout w:type="fixed"/>
         <w:tblCellMar>
-          <w:top w:w="0" w:type="dxa"/>
           <w:left w:w="5" w:type="dxa"/>
-          <w:bottom w:w="0" w:type="dxa"/>
           <w:right w:w="5" w:type="dxa"/>
         </w:tblCellMar>
+        <w:tblLook w:val="0000" w:firstRow="0" w:lastRow="0" w:firstColumn="0" w:lastColumn="0" w:noHBand="0" w:noVBand="0"/>
       </w:tblPr>
       <w:tblGrid>
         <w:gridCol w:w="4602"/>
@@ -248,7 +646,7 @@
       </w:tblGrid>
       <w:tr>
         <w:trPr>
-          <w:trHeight w:val="365" w:hRule="atLeast"/>
+          <w:trHeight w:val="365"/>
         </w:trPr>
         <w:tc>
           <w:tcPr>
@@ -259,13 +657,13 @@
               <w:bottom w:val="single" w:sz="4" w:space="0" w:color="000000"/>
               <w:right w:val="single" w:sz="4" w:space="0" w:color="000000"/>
             </w:tcBorders>
-            <w:shd w:fill="E7E6E6" w:val="clear"/>
-          </w:tcPr>
-          <w:p>
-            <w:pPr>
-              <w:pStyle w:val="TableParagraph"/>
-              <w:spacing w:before="60" w:after="0"/>
-              <w:ind w:left="80" w:right="0"/>
+            <w:shd w:val="clear" w:color="auto" w:fill="E7E6E6"/>
+          </w:tcPr>
+          <w:p>
+            <w:pPr>
+              <w:pStyle w:val="TableParagraph"/>
+              <w:spacing w:before="60"/>
+              <w:ind w:left="80"/>
               <w:rPr>
                 <w:rFonts w:ascii="Calibri" w:hAnsi="Calibri"/>
                 <w:b/>
@@ -292,13 +690,13 @@
               <w:bottom w:val="single" w:sz="4" w:space="0" w:color="000000"/>
               <w:right w:val="single" w:sz="4" w:space="0" w:color="000000"/>
             </w:tcBorders>
-            <w:shd w:fill="E7E6E6" w:val="clear"/>
-          </w:tcPr>
-          <w:p>
-            <w:pPr>
-              <w:pStyle w:val="TableParagraph"/>
-              <w:spacing w:before="60" w:after="0"/>
-              <w:ind w:left="80" w:right="0"/>
+            <w:shd w:val="clear" w:color="auto" w:fill="E7E6E6"/>
+          </w:tcPr>
+          <w:p>
+            <w:pPr>
+              <w:pStyle w:val="TableParagraph"/>
+              <w:spacing w:before="60"/>
+              <w:ind w:left="80"/>
               <w:rPr>
                 <w:rFonts w:ascii="Calibri" w:hAnsi="Calibri"/>
                 <w:b/>
@@ -327,7 +725,7 @@
       </w:tr>
       <w:tr>
         <w:trPr>
-          <w:trHeight w:val="380" w:hRule="atLeast"/>
+          <w:trHeight w:val="380"/>
         </w:trPr>
         <w:tc>
           <w:tcPr>
@@ -342,8 +740,8 @@
           <w:p>
             <w:pPr>
               <w:pStyle w:val="TableParagraph"/>
-              <w:spacing w:before="54" w:after="0"/>
-              <w:ind w:left="80" w:right="0"/>
+              <w:spacing w:before="54"/>
+              <w:ind w:left="80"/>
               <w:rPr>
                 <w:rFonts w:ascii="Calibri" w:hAnsi="Calibri"/>
                 <w:sz w:val="20"/>
@@ -436,7 +834,7 @@
       </w:tr>
       <w:tr>
         <w:trPr>
-          <w:trHeight w:val="375" w:hRule="atLeast"/>
+          <w:trHeight w:val="375"/>
         </w:trPr>
         <w:tc>
           <w:tcPr>
@@ -451,8 +849,8 @@
           <w:p>
             <w:pPr>
               <w:pStyle w:val="TableParagraph"/>
-              <w:spacing w:before="54" w:after="0"/>
-              <w:ind w:left="80" w:right="0"/>
+              <w:spacing w:before="54"/>
+              <w:ind w:left="80"/>
               <w:rPr>
                 <w:rFonts w:ascii="Calibri" w:hAnsi="Calibri"/>
                 <w:sz w:val="20"/>
@@ -582,7 +980,7 @@
       </w:tr>
       <w:tr>
         <w:trPr>
-          <w:trHeight w:val="380" w:hRule="atLeast"/>
+          <w:trHeight w:val="380"/>
         </w:trPr>
         <w:tc>
           <w:tcPr>
@@ -597,8 +995,8 @@
           <w:p>
             <w:pPr>
               <w:pStyle w:val="TableParagraph"/>
-              <w:spacing w:before="54" w:after="0"/>
-              <w:ind w:left="80" w:right="0"/>
+              <w:spacing w:before="54"/>
+              <w:ind w:left="80"/>
               <w:rPr>
                 <w:rFonts w:ascii="Calibri" w:hAnsi="Calibri"/>
                 <w:sz w:val="20"/>
@@ -692,10 +1090,8 @@
     </w:tbl>
     <w:p>
       <w:pPr>
-        <w:pStyle w:val="Normal"/>
-        <w:spacing w:before="131" w:after="0"/>
-        <w:ind w:hanging="0" w:left="220" w:right="0"/>
-        <w:jc w:val="left"/>
+        <w:spacing w:before="131"/>
+        <w:ind w:left="220"/>
         <w:rPr>
           <w:b/>
           <w:sz w:val="20"/>
@@ -870,31 +1266,23 @@
     <w:p>
       <w:pPr>
         <w:pStyle w:val="BodyText"/>
-        <w:spacing w:before="10" w:after="0"/>
+        <w:spacing w:before="10"/>
         <w:rPr>
           <w:b/>
           <w:sz w:val="5"/>
         </w:rPr>
       </w:pPr>
-      <w:r>
-        <w:rPr>
-          <w:b/>
-          <w:sz w:val="5"/>
-        </w:rPr>
-      </w:r>
     </w:p>
     <w:tbl>
       <w:tblPr>
         <w:tblW w:w="9365" w:type="dxa"/>
-        <w:jc w:val="left"/>
         <w:tblInd w:w="220" w:type="dxa"/>
         <w:tblLayout w:type="fixed"/>
         <w:tblCellMar>
-          <w:top w:w="0" w:type="dxa"/>
           <w:left w:w="5" w:type="dxa"/>
-          <w:bottom w:w="0" w:type="dxa"/>
           <w:right w:w="5" w:type="dxa"/>
         </w:tblCellMar>
+        <w:tblLook w:val="0000" w:firstRow="0" w:lastRow="0" w:firstColumn="0" w:lastColumn="0" w:noHBand="0" w:noVBand="0"/>
       </w:tblPr>
       <w:tblGrid>
         <w:gridCol w:w="4602"/>
@@ -903,7 +1291,7 @@
       </w:tblGrid>
       <w:tr>
         <w:trPr>
-          <w:trHeight w:val="365" w:hRule="atLeast"/>
+          <w:trHeight w:val="365"/>
         </w:trPr>
         <w:tc>
           <w:tcPr>
@@ -914,13 +1302,13 @@
               <w:bottom w:val="single" w:sz="4" w:space="0" w:color="000000"/>
               <w:right w:val="single" w:sz="4" w:space="0" w:color="000000"/>
             </w:tcBorders>
-            <w:shd w:fill="E7E6E6" w:val="clear"/>
-          </w:tcPr>
-          <w:p>
-            <w:pPr>
-              <w:pStyle w:val="TableParagraph"/>
-              <w:spacing w:before="59" w:after="0"/>
-              <w:ind w:left="80" w:right="0"/>
+            <w:shd w:val="clear" w:color="auto" w:fill="E7E6E6"/>
+          </w:tcPr>
+          <w:p>
+            <w:pPr>
+              <w:pStyle w:val="TableParagraph"/>
+              <w:spacing w:before="59"/>
+              <w:ind w:left="80"/>
               <w:rPr>
                 <w:rFonts w:ascii="Calibri" w:hAnsi="Calibri"/>
                 <w:b/>
@@ -947,13 +1335,13 @@
               <w:bottom w:val="single" w:sz="4" w:space="0" w:color="000000"/>
               <w:right w:val="single" w:sz="4" w:space="0" w:color="000000"/>
             </w:tcBorders>
-            <w:shd w:fill="E7E6E6" w:val="clear"/>
-          </w:tcPr>
-          <w:p>
-            <w:pPr>
-              <w:pStyle w:val="TableParagraph"/>
-              <w:spacing w:before="59" w:after="0"/>
-              <w:ind w:left="80" w:right="0"/>
+            <w:shd w:val="clear" w:color="auto" w:fill="E7E6E6"/>
+          </w:tcPr>
+          <w:p>
+            <w:pPr>
+              <w:pStyle w:val="TableParagraph"/>
+              <w:spacing w:before="59"/>
+              <w:ind w:left="80"/>
               <w:rPr>
                 <w:rFonts w:ascii="Calibri" w:hAnsi="Calibri"/>
                 <w:b/>
@@ -980,13 +1368,13 @@
               <w:bottom w:val="single" w:sz="4" w:space="0" w:color="000000"/>
               <w:right w:val="single" w:sz="4" w:space="0" w:color="000000"/>
             </w:tcBorders>
-            <w:shd w:fill="E7E6E6" w:val="clear"/>
-          </w:tcPr>
-          <w:p>
-            <w:pPr>
-              <w:pStyle w:val="TableParagraph"/>
-              <w:spacing w:before="59" w:after="0"/>
-              <w:ind w:left="80" w:right="0"/>
+            <w:shd w:val="clear" w:color="auto" w:fill="E7E6E6"/>
+          </w:tcPr>
+          <w:p>
+            <w:pPr>
+              <w:pStyle w:val="TableParagraph"/>
+              <w:spacing w:before="59"/>
+              <w:ind w:left="80"/>
               <w:rPr>
                 <w:rFonts w:ascii="Calibri" w:hAnsi="Calibri"/>
                 <w:b/>
@@ -1007,7 +1395,7 @@
       </w:tr>
       <w:tr>
         <w:trPr>
-          <w:trHeight w:val="380" w:hRule="atLeast"/>
+          <w:trHeight w:val="380"/>
         </w:trPr>
         <w:tc>
           <w:tcPr>
@@ -1022,8 +1410,8 @@
           <w:p>
             <w:pPr>
               <w:pStyle w:val="TableParagraph"/>
-              <w:spacing w:before="54" w:after="0"/>
-              <w:ind w:left="80" w:right="0"/>
+              <w:spacing w:before="54"/>
+              <w:ind w:left="80"/>
               <w:rPr>
                 <w:rFonts w:ascii="Calibri" w:hAnsi="Calibri"/>
                 <w:sz w:val="20"/>
@@ -1175,7 +1563,7 @@
       </w:tr>
       <w:tr>
         <w:trPr>
-          <w:trHeight w:val="375" w:hRule="atLeast"/>
+          <w:trHeight w:val="375"/>
         </w:trPr>
         <w:tc>
           <w:tcPr>
@@ -1190,8 +1578,8 @@
           <w:p>
             <w:pPr>
               <w:pStyle w:val="TableParagraph"/>
-              <w:spacing w:before="49" w:after="0"/>
-              <w:ind w:left="80" w:right="0"/>
+              <w:spacing w:before="49"/>
+              <w:ind w:left="80"/>
               <w:rPr>
                 <w:rFonts w:ascii="Calibri" w:hAnsi="Calibri"/>
                 <w:sz w:val="20"/>
@@ -1365,7 +1753,7 @@
       </w:tr>
       <w:tr>
         <w:trPr>
-          <w:trHeight w:val="380" w:hRule="atLeast"/>
+          <w:trHeight w:val="380"/>
         </w:trPr>
         <w:tc>
           <w:tcPr>
@@ -1380,8 +1768,8 @@
           <w:p>
             <w:pPr>
               <w:pStyle w:val="TableParagraph"/>
-              <w:spacing w:before="55" w:after="0"/>
-              <w:ind w:left="80" w:right="0"/>
+              <w:spacing w:before="55"/>
+              <w:ind w:left="80"/>
               <w:rPr>
                 <w:rFonts w:ascii="Calibri" w:hAnsi="Calibri"/>
                 <w:sz w:val="20"/>
@@ -1488,7 +1876,7 @@
       </w:tr>
       <w:tr>
         <w:trPr>
-          <w:trHeight w:val="380" w:hRule="atLeast"/>
+          <w:trHeight w:val="380"/>
         </w:trPr>
         <w:tc>
           <w:tcPr>
@@ -1503,8 +1891,8 @@
           <w:p>
             <w:pPr>
               <w:pStyle w:val="TableParagraph"/>
-              <w:spacing w:before="54" w:after="0"/>
-              <w:ind w:left="80" w:right="0"/>
+              <w:spacing w:before="54"/>
+              <w:ind w:left="80"/>
               <w:rPr>
                 <w:rFonts w:ascii="Calibri" w:hAnsi="Calibri"/>
                 <w:sz w:val="20"/>
@@ -1671,7 +2059,7 @@
       </w:tr>
       <w:tr>
         <w:trPr>
-          <w:trHeight w:val="375" w:hRule="atLeast"/>
+          <w:trHeight w:val="375"/>
         </w:trPr>
         <w:tc>
           <w:tcPr>
@@ -1686,8 +2074,8 @@
           <w:p>
             <w:pPr>
               <w:pStyle w:val="TableParagraph"/>
-              <w:spacing w:before="49" w:after="0"/>
-              <w:ind w:left="80" w:right="0"/>
+              <w:spacing w:before="49"/>
+              <w:ind w:left="80"/>
               <w:rPr>
                 <w:rFonts w:ascii="Calibri" w:hAnsi="Calibri"/>
                 <w:sz w:val="20"/>
@@ -1824,7 +2212,7 @@
       </w:tr>
       <w:tr>
         <w:trPr>
-          <w:trHeight w:val="380" w:hRule="atLeast"/>
+          <w:trHeight w:val="380"/>
         </w:trPr>
         <w:tc>
           <w:tcPr>
@@ -1839,8 +2227,8 @@
           <w:p>
             <w:pPr>
               <w:pStyle w:val="TableParagraph"/>
-              <w:spacing w:before="54" w:after="0"/>
-              <w:ind w:left="80" w:right="0"/>
+              <w:spacing w:before="54"/>
+              <w:ind w:left="80"/>
               <w:rPr>
                 <w:rFonts w:ascii="Calibri" w:hAnsi="Calibri"/>
                 <w:sz w:val="20"/>
@@ -1985,10 +2373,8 @@
     </w:tbl>
     <w:p>
       <w:pPr>
-        <w:pStyle w:val="Normal"/>
-        <w:spacing w:before="131" w:after="0"/>
-        <w:ind w:hanging="0" w:left="220" w:right="0"/>
-        <w:jc w:val="left"/>
+        <w:spacing w:before="131"/>
+        <w:ind w:left="220"/>
         <w:rPr>
           <w:b/>
           <w:sz w:val="20"/>
@@ -2126,31 +2512,23 @@
     <w:p>
       <w:pPr>
         <w:pStyle w:val="BodyText"/>
-        <w:spacing w:before="10" w:after="0"/>
+        <w:spacing w:before="10"/>
         <w:rPr>
           <w:b/>
           <w:sz w:val="5"/>
         </w:rPr>
       </w:pPr>
-      <w:r>
-        <w:rPr>
-          <w:b/>
-          <w:sz w:val="5"/>
-        </w:rPr>
-      </w:r>
     </w:p>
     <w:tbl>
       <w:tblPr>
         <w:tblW w:w="9365" w:type="dxa"/>
-        <w:jc w:val="left"/>
         <w:tblInd w:w="220" w:type="dxa"/>
         <w:tblLayout w:type="fixed"/>
         <w:tblCellMar>
-          <w:top w:w="0" w:type="dxa"/>
           <w:left w:w="5" w:type="dxa"/>
-          <w:bottom w:w="0" w:type="dxa"/>
           <w:right w:w="5" w:type="dxa"/>
         </w:tblCellMar>
+        <w:tblLook w:val="0000" w:firstRow="0" w:lastRow="0" w:firstColumn="0" w:lastColumn="0" w:noHBand="0" w:noVBand="0"/>
       </w:tblPr>
       <w:tblGrid>
         <w:gridCol w:w="2200"/>
@@ -2159,7 +2537,7 @@
       </w:tblGrid>
       <w:tr>
         <w:trPr>
-          <w:trHeight w:val="365" w:hRule="atLeast"/>
+          <w:trHeight w:val="365"/>
         </w:trPr>
         <w:tc>
           <w:tcPr>
@@ -2170,13 +2548,13 @@
               <w:bottom w:val="single" w:sz="4" w:space="0" w:color="000000"/>
               <w:right w:val="single" w:sz="4" w:space="0" w:color="000000"/>
             </w:tcBorders>
-            <w:shd w:fill="E7E6E6" w:val="clear"/>
-          </w:tcPr>
-          <w:p>
-            <w:pPr>
-              <w:pStyle w:val="TableParagraph"/>
-              <w:spacing w:before="59" w:after="0"/>
-              <w:ind w:left="80" w:right="0"/>
+            <w:shd w:val="clear" w:color="auto" w:fill="E7E6E6"/>
+          </w:tcPr>
+          <w:p>
+            <w:pPr>
+              <w:pStyle w:val="TableParagraph"/>
+              <w:spacing w:before="59"/>
+              <w:ind w:left="80"/>
               <w:rPr>
                 <w:rFonts w:ascii="Calibri" w:hAnsi="Calibri"/>
                 <w:b/>
@@ -2203,13 +2581,13 @@
               <w:bottom w:val="single" w:sz="4" w:space="0" w:color="000000"/>
               <w:right w:val="single" w:sz="4" w:space="0" w:color="000000"/>
             </w:tcBorders>
-            <w:shd w:fill="E7E6E6" w:val="clear"/>
-          </w:tcPr>
-          <w:p>
-            <w:pPr>
-              <w:pStyle w:val="TableParagraph"/>
-              <w:spacing w:before="59" w:after="0"/>
-              <w:ind w:left="80" w:right="0"/>
+            <w:shd w:val="clear" w:color="auto" w:fill="E7E6E6"/>
+          </w:tcPr>
+          <w:p>
+            <w:pPr>
+              <w:pStyle w:val="TableParagraph"/>
+              <w:spacing w:before="59"/>
+              <w:ind w:left="80"/>
               <w:rPr>
                 <w:rFonts w:ascii="Calibri" w:hAnsi="Calibri"/>
                 <w:b/>
@@ -2244,13 +2622,13 @@
               <w:bottom w:val="single" w:sz="4" w:space="0" w:color="000000"/>
               <w:right w:val="single" w:sz="4" w:space="0" w:color="000000"/>
             </w:tcBorders>
-            <w:shd w:fill="E7E6E6" w:val="clear"/>
-          </w:tcPr>
-          <w:p>
-            <w:pPr>
-              <w:pStyle w:val="TableParagraph"/>
-              <w:spacing w:before="59" w:after="0"/>
-              <w:ind w:left="79" w:right="0"/>
+            <w:shd w:val="clear" w:color="auto" w:fill="E7E6E6"/>
+          </w:tcPr>
+          <w:p>
+            <w:pPr>
+              <w:pStyle w:val="TableParagraph"/>
+              <w:spacing w:before="59"/>
+              <w:ind w:left="79"/>
               <w:rPr>
                 <w:rFonts w:ascii="Calibri" w:hAnsi="Calibri"/>
                 <w:b/>
@@ -2288,7 +2666,7 @@
       </w:tr>
       <w:tr>
         <w:trPr>
-          <w:trHeight w:val="375" w:hRule="atLeast"/>
+          <w:trHeight w:val="375"/>
         </w:trPr>
         <w:tc>
           <w:tcPr>
@@ -2303,8 +2681,8 @@
           <w:p>
             <w:pPr>
               <w:pStyle w:val="TableParagraph"/>
-              <w:spacing w:before="54" w:after="0"/>
-              <w:ind w:left="80" w:right="0"/>
+              <w:spacing w:before="54"/>
+              <w:ind w:left="80"/>
               <w:rPr>
                 <w:rFonts w:ascii="Calibri" w:hAnsi="Calibri"/>
                 <w:sz w:val="20"/>
@@ -2381,7 +2759,7 @@
       </w:tr>
       <w:tr>
         <w:trPr>
-          <w:trHeight w:val="380" w:hRule="atLeast"/>
+          <w:trHeight w:val="380"/>
         </w:trPr>
         <w:tc>
           <w:tcPr>
@@ -2396,8 +2774,8 @@
           <w:p>
             <w:pPr>
               <w:pStyle w:val="TableParagraph"/>
-              <w:spacing w:before="54" w:after="0"/>
-              <w:ind w:left="80" w:right="0"/>
+              <w:spacing w:before="54"/>
+              <w:ind w:left="80"/>
               <w:rPr>
                 <w:rFonts w:ascii="Calibri" w:hAnsi="Calibri"/>
                 <w:sz w:val="20"/>
@@ -2474,7 +2852,7 @@
       </w:tr>
       <w:tr>
         <w:trPr>
-          <w:trHeight w:val="380" w:hRule="atLeast"/>
+          <w:trHeight w:val="380"/>
         </w:trPr>
         <w:tc>
           <w:tcPr>
@@ -2489,8 +2867,8 @@
           <w:p>
             <w:pPr>
               <w:pStyle w:val="TableParagraph"/>
-              <w:spacing w:before="55" w:after="0"/>
-              <w:ind w:left="80" w:right="0"/>
+              <w:spacing w:before="55"/>
+              <w:ind w:left="80"/>
               <w:rPr>
                 <w:rFonts w:ascii="Calibri" w:hAnsi="Calibri"/>
                 <w:sz w:val="20"/>
@@ -2567,7 +2945,7 @@
       </w:tr>
       <w:tr>
         <w:trPr>
-          <w:trHeight w:val="380" w:hRule="atLeast"/>
+          <w:trHeight w:val="380"/>
         </w:trPr>
         <w:tc>
           <w:tcPr>
@@ -2582,8 +2960,8 @@
           <w:p>
             <w:pPr>
               <w:pStyle w:val="TableParagraph"/>
-              <w:spacing w:before="54" w:after="0"/>
-              <w:ind w:left="80" w:right="0"/>
+              <w:spacing w:before="54"/>
+              <w:ind w:left="80"/>
               <w:rPr>
                 <w:rFonts w:ascii="Calibri" w:hAnsi="Calibri"/>
                 <w:sz w:val="20"/>
@@ -2660,7 +3038,7 @@
       </w:tr>
       <w:tr>
         <w:trPr>
-          <w:trHeight w:val="375" w:hRule="atLeast"/>
+          <w:trHeight w:val="375"/>
         </w:trPr>
         <w:tc>
           <w:tcPr>
@@ -2675,8 +3053,8 @@
           <w:p>
             <w:pPr>
               <w:pStyle w:val="TableParagraph"/>
-              <w:spacing w:before="49" w:after="0"/>
-              <w:ind w:left="80" w:right="0"/>
+              <w:spacing w:before="49"/>
+              <w:ind w:left="80"/>
               <w:rPr>
                 <w:rFonts w:ascii="Calibri" w:hAnsi="Calibri"/>
                 <w:sz w:val="20"/>
@@ -2755,539 +3133,235 @@
     <w:p>
       <w:pPr>
         <w:pStyle w:val="BodyText"/>
-        <w:spacing w:before="54" w:after="0"/>
-        <w:rPr>
-          <w:b/>
-          <w:sz w:val="20"/>
-        </w:rPr>
-      </w:pPr>
-      <w:r>
-        <w:rPr>
-          <w:b/>
-          <w:sz w:val="20"/>
-        </w:rPr>
-      </w:r>
+        <w:spacing w:before="54"/>
+        <w:rPr>
+          <w:b/>
+          <w:sz w:val="20"/>
+        </w:rPr>
+      </w:pPr>
     </w:p>
     <w:p>
       <w:pPr>
         <w:pStyle w:val="Heading1"/>
-        <w:numPr>
-          <w:ilvl w:val="0"/>
-          <w:numId w:val="0"/>
-        </w:numPr>
         <w:tabs>
-          <w:tab w:val="clear" w:pos="720"/>
-          <w:tab w:val="left" w:pos="638" w:leader="none"/>
+          <w:tab w:val="left" w:pos="638"/>
         </w:tabs>
-        <w:spacing w:lineRule="auto" w:line="240" w:before="1" w:after="0"/>
-        <w:ind w:hanging="0" w:left="638" w:right="0"/>
-        <w:jc w:val="left"/>
-        <w:rPr>
-          <w:spacing w:val="-2"/>
-        </w:rPr>
-      </w:pPr>
-      <w:r>
-        <w:rPr>
-          <w:b/>
-          <w:sz w:val="10"/>
-        </w:rPr>
-      </w:r>
+        <w:spacing w:before="1"/>
+        <w:ind w:left="638" w:firstLine="0"/>
+        <w:rPr>
+          <w:spacing w:val="-2"/>
+        </w:rPr>
+      </w:pPr>
     </w:p>
     <w:sectPr>
-      <w:footerReference w:type="default" r:id="rId3"/>
-      <w:footerReference w:type="first" r:id="rId4"/>
-      <w:type w:val="nextPage"/>
+      <w:footerReference w:type="default" r:id="rId9"/>
+      <w:footerReference w:type="first" r:id="rId10"/>
       <w:pgSz w:w="12240" w:h="15840"/>
-      <w:pgMar w:left="1080" w:right="1080" w:gutter="0" w:header="0" w:top="1280" w:footer="718" w:bottom="901"/>
-      <w:pgNumType w:fmt="decimal"/>
-      <w:formProt w:val="false"/>
-      <w:textDirection w:val="lrTb"/>
-      <w:docGrid w:type="default" w:linePitch="100" w:charSpace="4096"/>
+      <w:pgMar w:top="1280" w:right="1080" w:bottom="901" w:left="1080" w:header="0" w:footer="718" w:gutter="0"/>
+      <w:cols w:space="720"/>
+      <w:formProt w:val="0"/>
+      <w:docGrid w:linePitch="100" w:charSpace="4096"/>
     </w:sectPr>
   </w:body>
 </w:document>
 </file>
 
+<file path=word/endnotes.xml><?xml version="1.0" encoding="utf-8"?>
+<w:endnotes xmlns:wpc="http://schemas.microsoft.com/office/word/2010/wordprocessingCanvas" xmlns:cx="http://schemas.microsoft.com/office/drawing/2014/chartex" xmlns:cx1="http://schemas.microsoft.com/office/drawing/2015/9/8/chartex" xmlns:cx2="http://schemas.microsoft.com/office/drawing/2015/10/21/chartex" xmlns:cx3="http://schemas.microsoft.com/office/drawing/2016/5/9/chartex" xmlns:cx4="http://schemas.microsoft.com/office/drawing/2016/5/10/chartex" xmlns:cx5="http://schemas.microsoft.com/office/drawing/2016/5/11/chartex" xmlns:cx6="http://schemas.microsoft.com/office/drawing/2016/5/12/chartex" xmlns:cx7="http://schemas.microsoft.com/office/drawing/2016/5/13/chartex" xmlns:cx8="http://schemas.microsoft.com/office/drawing/2016/5/14/chartex" xmlns:mc="http://schemas.openxmlformats.org/markup-compatibility/2006" xmlns:aink="http://schemas.microsoft.com/office/drawing/2016/ink" xmlns:am3d="http://schemas.microsoft.com/office/drawing/2017/model3d" xmlns:o="urn:schemas-microsoft-com:office:office" xmlns:oel="http://schemas.microsoft.com/office/2019/extlst" xmlns:r="http://schemas.openxmlformats.org/officeDocument/2006/relationships" xmlns:m="http://schemas.openxmlformats.org/officeDocument/2006/math" xmlns:v="urn:schemas-microsoft-com:vml" xmlns:wp14="http://schemas.microsoft.com/office/word/2010/wordprocessingDrawing" xmlns:wp="http://schemas.openxmlformats.org/drawingml/2006/wordprocessingDrawing" xmlns:w10="urn:schemas-microsoft-com:office:word" xmlns:w="http://schemas.openxmlformats.org/wordprocessingml/2006/main" xmlns:w14="http://schemas.microsoft.com/office/word/2010/wordml" xmlns:w15="http://schemas.microsoft.com/office/word/2012/wordml" xmlns:w16cex="http://schemas.microsoft.com/office/word/2018/wordml/cex" xmlns:w16cid="http://schemas.microsoft.com/office/word/2016/wordml/cid" xmlns:w16="http://schemas.microsoft.com/office/word/2018/wordml" xmlns:w16du="http://schemas.microsoft.com/office/word/2023/wordml/word16du" xmlns:w16sdtdh="http://schemas.microsoft.com/office/word/2020/wordml/sdtdatahash" xmlns:w16sdtfl="http://schemas.microsoft.com/office/word/2024/wordml/sdtformatlock" xmlns:w16se="http://schemas.microsoft.com/office/word/2015/wordml/symex" xmlns:wpg="http://schemas.microsoft.com/office/word/2010/wordprocessingGroup" xmlns:wpi="http://schemas.microsoft.com/office/word/2010/wordprocessingInk" xmlns:wne="http://schemas.microsoft.com/office/word/2006/wordml" xmlns:wps="http://schemas.microsoft.com/office/word/2010/wordprocessingShape" mc:Ignorable="w14 w15 w16se w16cid w16 w16cex w16sdtdh w16sdtfl w16du wp14">
+  <w:endnote w:type="separator" w:id="-1">
+    <w:p>
+      <w:r>
+        <w:separator/>
+      </w:r>
+    </w:p>
+  </w:endnote>
+  <w:endnote w:type="continuationSeparator" w:id="0">
+    <w:p>
+      <w:r>
+        <w:continuationSeparator/>
+      </w:r>
+    </w:p>
+  </w:endnote>
+</w:endnotes>
+</file>
+
 <file path=word/footer1.xml><?xml version="1.0" encoding="utf-8"?>
-<w:ftr xmlns:o="urn:schemas-microsoft-com:office:office" xmlns:r="http://schemas.openxmlformats.org/officeDocument/2006/relationships" xmlns:v="urn:schemas-microsoft-com:vml" xmlns:w="http://schemas.openxmlformats.org/wordprocessingml/2006/main" xmlns:w10="urn:schemas-microsoft-com:office:word" xmlns:wp="http://schemas.openxmlformats.org/drawingml/2006/wordprocessingDrawing" xmlns:wps="http://schemas.microsoft.com/office/word/2010/wordprocessingShape" xmlns:wpg="http://schemas.microsoft.com/office/word/2010/wordprocessingGroup" xmlns:mc="http://schemas.openxmlformats.org/markup-compatibility/2006" xmlns:wp14="http://schemas.microsoft.com/office/word/2010/wordprocessingDrawing" xmlns:w14="http://schemas.microsoft.com/office/word/2010/wordml" xmlns:w15="http://schemas.microsoft.com/office/word/2012/wordml" mc:Ignorable="w14 wp14 w15">
+<w:ftr xmlns:wpc="http://schemas.microsoft.com/office/word/2010/wordprocessingCanvas" xmlns:cx="http://schemas.microsoft.com/office/drawing/2014/chartex" xmlns:cx1="http://schemas.microsoft.com/office/drawing/2015/9/8/chartex" xmlns:cx2="http://schemas.microsoft.com/office/drawing/2015/10/21/chartex" xmlns:cx3="http://schemas.microsoft.com/office/drawing/2016/5/9/chartex" xmlns:cx4="http://schemas.microsoft.com/office/drawing/2016/5/10/chartex" xmlns:cx5="http://schemas.microsoft.com/office/drawing/2016/5/11/chartex" xmlns:cx6="http://schemas.microsoft.com/office/drawing/2016/5/12/chartex" xmlns:cx7="http://schemas.microsoft.com/office/drawing/2016/5/13/chartex" xmlns:cx8="http://schemas.microsoft.com/office/drawing/2016/5/14/chartex" xmlns:mc="http://schemas.openxmlformats.org/markup-compatibility/2006" xmlns:aink="http://schemas.microsoft.com/office/drawing/2016/ink" xmlns:am3d="http://schemas.microsoft.com/office/drawing/2017/model3d" xmlns:o="urn:schemas-microsoft-com:office:office" xmlns:oel="http://schemas.microsoft.com/office/2019/extlst" xmlns:r="http://schemas.openxmlformats.org/officeDocument/2006/relationships" xmlns:m="http://schemas.openxmlformats.org/officeDocument/2006/math" xmlns:v="urn:schemas-microsoft-com:vml" xmlns:wp14="http://schemas.microsoft.com/office/word/2010/wordprocessingDrawing" xmlns:wp="http://schemas.openxmlformats.org/drawingml/2006/wordprocessingDrawing" xmlns:w10="urn:schemas-microsoft-com:office:word" xmlns:w="http://schemas.openxmlformats.org/wordprocessingml/2006/main" xmlns:w14="http://schemas.microsoft.com/office/word/2010/wordml" xmlns:w15="http://schemas.microsoft.com/office/word/2012/wordml" xmlns:w16cex="http://schemas.microsoft.com/office/word/2018/wordml/cex" xmlns:w16cid="http://schemas.microsoft.com/office/word/2016/wordml/cid" xmlns:w16="http://schemas.microsoft.com/office/word/2018/wordml" xmlns:w16du="http://schemas.microsoft.com/office/word/2023/wordml/word16du" xmlns:w16sdtdh="http://schemas.microsoft.com/office/word/2020/wordml/sdtdatahash" xmlns:w16sdtfl="http://schemas.microsoft.com/office/word/2024/wordml/sdtformatlock" xmlns:w16se="http://schemas.microsoft.com/office/word/2015/wordml/symex" xmlns:wpg="http://schemas.microsoft.com/office/word/2010/wordprocessingGroup" xmlns:wpi="http://schemas.microsoft.com/office/word/2010/wordprocessingInk" xmlns:wne="http://schemas.microsoft.com/office/word/2006/wordml" xmlns:wps="http://schemas.microsoft.com/office/word/2010/wordprocessingShape" mc:Ignorable="w14 w15 w16se w16cid w16 w16cex w16sdtdh w16sdtfl w16du wp14">
   <w:p>
     <w:pPr>
       <w:pStyle w:val="BodyText"/>
-      <w:spacing w:lineRule="auto" w:line="12"/>
+      <w:spacing w:line="12" w:lineRule="auto"/>
       <w:rPr>
         <w:sz w:val="20"/>
       </w:rPr>
     </w:pPr>
     <w:r>
       <w:rPr>
-        <w:sz w:val="20"/>
+        <w:noProof/>
       </w:rPr>
-      <mc:AlternateContent>
-        <mc:Choice Requires="wps">
-          <w:drawing>
-            <wp:anchor behindDoc="1" distT="0" distB="0" distL="0" distR="0" simplePos="0" locked="0" layoutInCell="0" allowOverlap="1" relativeHeight="2">
-              <wp:simplePos x="0" y="0"/>
-              <wp:positionH relativeFrom="page">
-                <wp:posOffset>6800215</wp:posOffset>
-              </wp:positionH>
-              <wp:positionV relativeFrom="page">
-                <wp:posOffset>9462770</wp:posOffset>
-              </wp:positionV>
-              <wp:extent cx="196850" cy="158750"/>
-              <wp:effectExtent l="0" t="0" r="0" b="0"/>
-              <wp:wrapNone/>
-              <wp:docPr id="1" name="Textbox 1"/>
-              <a:graphic xmlns:a="http://schemas.openxmlformats.org/drawingml/2006/main">
-                <a:graphicData uri="http://schemas.microsoft.com/office/word/2010/wordprocessingShape">
-                  <wps:wsp>
-                    <wps:cNvSpPr/>
-                    <wps:spPr>
-                      <a:xfrm>
-                        <a:off x="0" y="0"/>
-                        <a:ext cx="196920" cy="158760"/>
-                      </a:xfrm>
-                      <a:prstGeom prst="rect">
-                        <a:avLst/>
-                      </a:prstGeom>
-                      <a:noFill/>
-                      <a:ln w="0">
-                        <a:noFill/>
-                      </a:ln>
-                    </wps:spPr>
-                    <wps:style>
-                      <a:lnRef idx="0"/>
-                      <a:fillRef idx="0"/>
-                      <a:effectRef idx="0"/>
-                      <a:fontRef idx="minor"/>
-                    </wps:style>
-                    <wps:txbx>
-                      <w:txbxContent>
-                        <w:p>
-                          <w:pPr>
-                            <w:pStyle w:val="FrameContents"/>
-                            <w:spacing w:lineRule="exact" w:line="234" w:before="0" w:after="0"/>
-                            <w:ind w:hanging="0" w:left="20" w:right="0"/>
-                            <w:jc w:val="left"/>
-                            <w:rPr>
-                              <w:sz w:val="21"/>
-                            </w:rPr>
-                          </w:pPr>
-                          <w:r>
-                            <w:rPr>
-                              <w:spacing w:val="-5"/>
-                              <w:sz w:val="21"/>
-                            </w:rPr>
-                            <w:fldChar w:fldCharType="begin"/>
-                          </w:r>
-                          <w:r>
-                            <w:rPr>
-                              <w:sz w:val="21"/>
-                              <w:spacing w:val="-5"/>
-                            </w:rPr>
-                            <w:instrText xml:space="preserve"> PAGE </w:instrText>
-                          </w:r>
-                          <w:r>
-                            <w:rPr>
-                              <w:sz w:val="21"/>
-                              <w:spacing w:val="-5"/>
-                            </w:rPr>
-                            <w:fldChar w:fldCharType="separate"/>
-                          </w:r>
-                          <w:r>
-                            <w:rPr>
-                              <w:sz w:val="21"/>
-                              <w:spacing w:val="-5"/>
-                            </w:rPr>
-                            <w:t>1</w:t>
-                          </w:r>
-                          <w:r>
-                            <w:rPr>
-                              <w:sz w:val="21"/>
-                              <w:spacing w:val="-5"/>
-                            </w:rPr>
-                            <w:fldChar w:fldCharType="end"/>
-                          </w:r>
-                        </w:p>
-                      </w:txbxContent>
-                    </wps:txbx>
-                    <wps:bodyPr lIns="0" rIns="0" tIns="0" bIns="0" anchor="t">
-                      <a:noAutofit/>
-                    </wps:bodyPr>
-                  </wps:wsp>
-                </a:graphicData>
-              </a:graphic>
-            </wp:anchor>
-          </w:drawing>
-        </mc:Choice>
-        <mc:Fallback>
-          <w:pict>
-            <v:rect id="shape_0" ID="Textbox 1" path="m0,0l-2147483645,0l-2147483645,-2147483646l0,-2147483646xe" stroked="f" o:allowincell="f" style="position:absolute;margin-left:535.45pt;margin-top:745.1pt;width:15.45pt;height:12.45pt;mso-wrap-style:square;v-text-anchor:top;mso-position-horizontal-relative:page;mso-position-vertical-relative:page">
-              <v:fill o:detectmouseclick="t" on="false"/>
-              <v:stroke color="#3465a4" joinstyle="round" endcap="flat"/>
-              <v:textbox>
-                <w:txbxContent>
-                  <w:p>
-                    <w:pPr>
-                      <w:pStyle w:val="FrameContents"/>
-                      <w:spacing w:lineRule="exact" w:line="234" w:before="0" w:after="0"/>
-                      <w:ind w:hanging="0" w:left="20" w:right="0"/>
-                      <w:jc w:val="left"/>
-                      <w:rPr>
-                        <w:sz w:val="21"/>
-                      </w:rPr>
-                    </w:pPr>
-                    <w:r>
-                      <w:rPr>
-                        <w:spacing w:val="-5"/>
-                        <w:sz w:val="21"/>
-                      </w:rPr>
-                      <w:fldChar w:fldCharType="begin"/>
-                    </w:r>
-                    <w:r>
-                      <w:rPr>
-                        <w:sz w:val="21"/>
-                        <w:spacing w:val="-5"/>
-                      </w:rPr>
-                      <w:instrText xml:space="preserve"> PAGE </w:instrText>
-                    </w:r>
-                    <w:r>
-                      <w:rPr>
-                        <w:sz w:val="21"/>
-                        <w:spacing w:val="-5"/>
-                      </w:rPr>
-                      <w:fldChar w:fldCharType="separate"/>
-                    </w:r>
-                    <w:r>
-                      <w:rPr>
-                        <w:sz w:val="21"/>
-                        <w:spacing w:val="-5"/>
-                      </w:rPr>
-                      <w:t>1</w:t>
-                    </w:r>
-                    <w:r>
-                      <w:rPr>
-                        <w:sz w:val="21"/>
-                        <w:spacing w:val="-5"/>
-                      </w:rPr>
-                      <w:fldChar w:fldCharType="end"/>
-                    </w:r>
-                  </w:p>
-                </w:txbxContent>
-              </v:textbox>
-              <w10:wrap type="none"/>
-            </v:rect>
-          </w:pict>
-        </mc:Fallback>
-      </mc:AlternateContent>
+      <w:pict w14:anchorId="11FDFB14">
+        <v:rect id="Textbox 1" o:spid="_x0000_s1026" style="position:absolute;margin-left:535.45pt;margin-top:745.1pt;width:15.5pt;height:12.5pt;z-index:-251658752;visibility:visible;mso-wrap-style:square;mso-wrap-distance-left:0;mso-wrap-distance-top:0;mso-wrap-distance-right:0;mso-wrap-distance-bottom:0;mso-position-horizontal:absolute;mso-position-horizontal-relative:page;mso-position-vertical:absolute;mso-position-vertical-relative:page;v-text-anchor:top" o:gfxdata="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" o:allowincell="f" filled="f" stroked="f" strokeweight="0">
+          <v:textbox inset="0,0,0,0">
+            <w:txbxContent>
+              <w:p>
+                <w:pPr>
+                  <w:pStyle w:val="FrameContents"/>
+                  <w:spacing w:line="234" w:lineRule="exact"/>
+                  <w:ind w:left="20"/>
+                  <w:rPr>
+                    <w:sz w:val="21"/>
+                  </w:rPr>
+                </w:pPr>
+                <w:r>
+                  <w:rPr>
+                    <w:spacing w:val="-5"/>
+                    <w:sz w:val="21"/>
+                  </w:rPr>
+                  <w:fldChar w:fldCharType="begin"/>
+                </w:r>
+                <w:r>
+                  <w:rPr>
+                    <w:spacing w:val="-5"/>
+                    <w:sz w:val="21"/>
+                  </w:rPr>
+                  <w:instrText xml:space="preserve"> PAGE </w:instrText>
+                </w:r>
+                <w:r>
+                  <w:rPr>
+                    <w:spacing w:val="-5"/>
+                    <w:sz w:val="21"/>
+                  </w:rPr>
+                  <w:fldChar w:fldCharType="separate"/>
+                </w:r>
+                <w:r>
+                  <w:rPr>
+                    <w:spacing w:val="-5"/>
+                    <w:sz w:val="21"/>
+                  </w:rPr>
+                  <w:t>1</w:t>
+                </w:r>
+                <w:r>
+                  <w:rPr>
+                    <w:spacing w:val="-5"/>
+                    <w:sz w:val="21"/>
+                  </w:rPr>
+                  <w:fldChar w:fldCharType="end"/>
+                </w:r>
+              </w:p>
+            </w:txbxContent>
+          </v:textbox>
+          <w10:wrap anchorx="page" anchory="page"/>
+        </v:rect>
+      </w:pict>
     </w:r>
   </w:p>
 </w:ftr>
 </file>
 
 <file path=word/footer2.xml><?xml version="1.0" encoding="utf-8"?>
-<w:ftr xmlns:o="urn:schemas-microsoft-com:office:office" xmlns:r="http://schemas.openxmlformats.org/officeDocument/2006/relationships" xmlns:v="urn:schemas-microsoft-com:vml" xmlns:w="http://schemas.openxmlformats.org/wordprocessingml/2006/main" xmlns:w10="urn:schemas-microsoft-com:office:word" xmlns:wp="http://schemas.openxmlformats.org/drawingml/2006/wordprocessingDrawing" xmlns:wps="http://schemas.microsoft.com/office/word/2010/wordprocessingShape" xmlns:wpg="http://schemas.microsoft.com/office/word/2010/wordprocessingGroup" xmlns:mc="http://schemas.openxmlformats.org/markup-compatibility/2006" xmlns:wp14="http://schemas.microsoft.com/office/word/2010/wordprocessingDrawing" xmlns:w14="http://schemas.microsoft.com/office/word/2010/wordml" xmlns:w15="http://schemas.microsoft.com/office/word/2012/wordml" mc:Ignorable="w14 wp14 w15">
+<w:ftr xmlns:wpc="http://schemas.microsoft.com/office/word/2010/wordprocessingCanvas" xmlns:cx="http://schemas.microsoft.com/office/drawing/2014/chartex" xmlns:cx1="http://schemas.microsoft.com/office/drawing/2015/9/8/chartex" xmlns:cx2="http://schemas.microsoft.com/office/drawing/2015/10/21/chartex" xmlns:cx3="http://schemas.microsoft.com/office/drawing/2016/5/9/chartex" xmlns:cx4="http://schemas.microsoft.com/office/drawing/2016/5/10/chartex" xmlns:cx5="http://schemas.microsoft.com/office/drawing/2016/5/11/chartex" xmlns:cx6="http://schemas.microsoft.com/office/drawing/2016/5/12/chartex" xmlns:cx7="http://schemas.microsoft.com/office/drawing/2016/5/13/chartex" xmlns:cx8="http://schemas.microsoft.com/office/drawing/2016/5/14/chartex" xmlns:mc="http://schemas.openxmlformats.org/markup-compatibility/2006" xmlns:aink="http://schemas.microsoft.com/office/drawing/2016/ink" xmlns:am3d="http://schemas.microsoft.com/office/drawing/2017/model3d" xmlns:o="urn:schemas-microsoft-com:office:office" xmlns:oel="http://schemas.microsoft.com/office/2019/extlst" xmlns:r="http://schemas.openxmlformats.org/officeDocument/2006/relationships" xmlns:m="http://schemas.openxmlformats.org/officeDocument/2006/math" xmlns:v="urn:schemas-microsoft-com:vml" xmlns:wp14="http://schemas.microsoft.com/office/word/2010/wordprocessingDrawing" xmlns:wp="http://schemas.openxmlformats.org/drawingml/2006/wordprocessingDrawing" xmlns:w10="urn:schemas-microsoft-com:office:word" xmlns:w="http://schemas.openxmlformats.org/wordprocessingml/2006/main" xmlns:w14="http://schemas.microsoft.com/office/word/2010/wordml" xmlns:w15="http://schemas.microsoft.com/office/word/2012/wordml" xmlns:w16cex="http://schemas.microsoft.com/office/word/2018/wordml/cex" xmlns:w16cid="http://schemas.microsoft.com/office/word/2016/wordml/cid" xmlns:w16="http://schemas.microsoft.com/office/word/2018/wordml" xmlns:w16du="http://schemas.microsoft.com/office/word/2023/wordml/word16du" xmlns:w16sdtdh="http://schemas.microsoft.com/office/word/2020/wordml/sdtdatahash" xmlns:w16sdtfl="http://schemas.microsoft.com/office/word/2024/wordml/sdtformatlock" xmlns:w16se="http://schemas.microsoft.com/office/word/2015/wordml/symex" xmlns:wpg="http://schemas.microsoft.com/office/word/2010/wordprocessingGroup" xmlns:wpi="http://schemas.microsoft.com/office/word/2010/wordprocessingInk" xmlns:wne="http://schemas.microsoft.com/office/word/2006/wordml" xmlns:wps="http://schemas.microsoft.com/office/word/2010/wordprocessingShape" mc:Ignorable="w14 w15 w16se w16cid w16 w16cex w16sdtdh w16sdtfl w16du wp14">
   <w:p>
     <w:pPr>
       <w:pStyle w:val="BodyText"/>
-      <w:spacing w:lineRule="auto" w:line="12"/>
+      <w:spacing w:line="12" w:lineRule="auto"/>
       <w:rPr>
         <w:sz w:val="20"/>
       </w:rPr>
     </w:pPr>
     <w:r>
       <w:rPr>
-        <w:sz w:val="20"/>
+        <w:noProof/>
       </w:rPr>
-      <mc:AlternateContent>
-        <mc:Choice Requires="wps">
-          <w:drawing>
-            <wp:anchor behindDoc="1" distT="0" distB="0" distL="0" distR="0" simplePos="0" locked="0" layoutInCell="0" allowOverlap="1" relativeHeight="6">
-              <wp:simplePos x="0" y="0"/>
-              <wp:positionH relativeFrom="page">
-                <wp:posOffset>6800215</wp:posOffset>
-              </wp:positionH>
-              <wp:positionV relativeFrom="page">
-                <wp:posOffset>9462770</wp:posOffset>
-              </wp:positionV>
-              <wp:extent cx="196850" cy="158750"/>
-              <wp:effectExtent l="0" t="0" r="0" b="0"/>
-              <wp:wrapNone/>
-              <wp:docPr id="2" name="Textbox 45"/>
-              <a:graphic xmlns:a="http://schemas.openxmlformats.org/drawingml/2006/main">
-                <a:graphicData uri="http://schemas.microsoft.com/office/word/2010/wordprocessingShape">
-                  <wps:wsp>
-                    <wps:cNvSpPr/>
-                    <wps:spPr>
-                      <a:xfrm>
-                        <a:off x="0" y="0"/>
-                        <a:ext cx="196920" cy="158760"/>
-                      </a:xfrm>
-                      <a:prstGeom prst="rect">
-                        <a:avLst/>
-                      </a:prstGeom>
-                      <a:noFill/>
-                      <a:ln w="0">
-                        <a:noFill/>
-                      </a:ln>
-                    </wps:spPr>
-                    <wps:style>
-                      <a:lnRef idx="0"/>
-                      <a:fillRef idx="0"/>
-                      <a:effectRef idx="0"/>
-                      <a:fontRef idx="minor"/>
-                    </wps:style>
-                    <wps:txbx>
-                      <w:txbxContent>
-                        <w:p>
-                          <w:pPr>
-                            <w:pStyle w:val="FrameContents"/>
-                            <w:spacing w:lineRule="exact" w:line="234" w:before="0" w:after="0"/>
-                            <w:ind w:hanging="0" w:left="20" w:right="0"/>
-                            <w:jc w:val="left"/>
-                            <w:rPr>
-                              <w:sz w:val="21"/>
-                            </w:rPr>
-                          </w:pPr>
-                          <w:r>
-                            <w:rPr>
-                              <w:spacing w:val="-5"/>
-                              <w:sz w:val="21"/>
-                            </w:rPr>
-                            <w:fldChar w:fldCharType="begin"/>
-                          </w:r>
-                          <w:r>
-                            <w:rPr>
-                              <w:sz w:val="21"/>
-                              <w:spacing w:val="-5"/>
-                            </w:rPr>
-                            <w:instrText xml:space="preserve"> PAGE </w:instrText>
-                          </w:r>
-                          <w:r>
-                            <w:rPr>
-                              <w:sz w:val="21"/>
-                              <w:spacing w:val="-5"/>
-                            </w:rPr>
-                            <w:fldChar w:fldCharType="separate"/>
-                          </w:r>
-                          <w:r>
-                            <w:rPr>
-                              <w:sz w:val="21"/>
-                              <w:spacing w:val="-5"/>
-                            </w:rPr>
-                            <w:t>2</w:t>
-                          </w:r>
-                          <w:r>
-                            <w:rPr>
-                              <w:sz w:val="21"/>
-                              <w:spacing w:val="-5"/>
-                            </w:rPr>
-                            <w:fldChar w:fldCharType="end"/>
-                          </w:r>
-                        </w:p>
-                      </w:txbxContent>
-                    </wps:txbx>
-                    <wps:bodyPr lIns="0" rIns="0" tIns="0" bIns="0" anchor="t">
-                      <a:noAutofit/>
-                    </wps:bodyPr>
-                  </wps:wsp>
-                </a:graphicData>
-              </a:graphic>
-            </wp:anchor>
-          </w:drawing>
-        </mc:Choice>
-        <mc:Fallback>
-          <w:pict>
-            <v:rect id="shape_0" ID="Textbox 45" path="m0,0l-2147483645,0l-2147483645,-2147483646l0,-2147483646xe" stroked="f" o:allowincell="f" style="position:absolute;margin-left:535.45pt;margin-top:745.1pt;width:15.45pt;height:12.45pt;mso-wrap-style:square;v-text-anchor:top;mso-position-horizontal-relative:page;mso-position-vertical-relative:page">
-              <v:fill o:detectmouseclick="t" on="false"/>
-              <v:stroke color="#3465a4" joinstyle="round" endcap="flat"/>
-              <v:textbox>
-                <w:txbxContent>
-                  <w:p>
-                    <w:pPr>
-                      <w:pStyle w:val="FrameContents"/>
-                      <w:spacing w:lineRule="exact" w:line="234" w:before="0" w:after="0"/>
-                      <w:ind w:hanging="0" w:left="20" w:right="0"/>
-                      <w:jc w:val="left"/>
-                      <w:rPr>
-                        <w:sz w:val="21"/>
-                      </w:rPr>
-                    </w:pPr>
-                    <w:r>
-                      <w:rPr>
-                        <w:spacing w:val="-5"/>
-                        <w:sz w:val="21"/>
-                      </w:rPr>
-                      <w:fldChar w:fldCharType="begin"/>
-                    </w:r>
-                    <w:r>
-                      <w:rPr>
-                        <w:sz w:val="21"/>
-                        <w:spacing w:val="-5"/>
-                      </w:rPr>
-                      <w:instrText xml:space="preserve"> PAGE </w:instrText>
-                    </w:r>
-                    <w:r>
-                      <w:rPr>
-                        <w:sz w:val="21"/>
-                        <w:spacing w:val="-5"/>
-                      </w:rPr>
-                      <w:fldChar w:fldCharType="separate"/>
-                    </w:r>
-                    <w:r>
-                      <w:rPr>
-                        <w:sz w:val="21"/>
-                        <w:spacing w:val="-5"/>
-                      </w:rPr>
-                      <w:t>2</w:t>
-                    </w:r>
-                    <w:r>
-                      <w:rPr>
-                        <w:sz w:val="21"/>
-                        <w:spacing w:val="-5"/>
-                      </w:rPr>
-                      <w:fldChar w:fldCharType="end"/>
-                    </w:r>
-                  </w:p>
-                </w:txbxContent>
-              </v:textbox>
-              <w10:wrap type="none"/>
-            </v:rect>
-          </w:pict>
-        </mc:Fallback>
-      </mc:AlternateContent>
+      <w:pict w14:anchorId="2FE18E6A">
+        <v:rect id="Textbox 45" o:spid="_x0000_s1025" style="position:absolute;margin-left:535.45pt;margin-top:745.1pt;width:15.5pt;height:12.5pt;z-index:-503316474;visibility:visible;mso-wrap-style:square;mso-wrap-distance-left:0;mso-wrap-distance-top:0;mso-wrap-distance-right:0;mso-wrap-distance-bottom:0;mso-position-horizontal:absolute;mso-position-horizontal-relative:page;mso-position-vertical:absolute;mso-position-vertical-relative:page;v-text-anchor:top" o:gfxdata="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" o:allowincell="f" filled="f" stroked="f" strokeweight="0">
+          <v:textbox inset="0,0,0,0">
+            <w:txbxContent>
+              <w:p>
+                <w:pPr>
+                  <w:pStyle w:val="FrameContents"/>
+                  <w:spacing w:line="234" w:lineRule="exact"/>
+                  <w:ind w:left="20"/>
+                  <w:rPr>
+                    <w:sz w:val="21"/>
+                  </w:rPr>
+                </w:pPr>
+                <w:r>
+                  <w:rPr>
+                    <w:spacing w:val="-5"/>
+                    <w:sz w:val="21"/>
+                  </w:rPr>
+                  <w:fldChar w:fldCharType="begin"/>
+                </w:r>
+                <w:r>
+                  <w:rPr>
+                    <w:spacing w:val="-5"/>
+                    <w:sz w:val="21"/>
+                  </w:rPr>
+                  <w:instrText xml:space="preserve"> PAGE </w:instrText>
+                </w:r>
+                <w:r>
+                  <w:rPr>
+                    <w:spacing w:val="-5"/>
+                    <w:sz w:val="21"/>
+                  </w:rPr>
+                  <w:fldChar w:fldCharType="separate"/>
+                </w:r>
+                <w:r>
+                  <w:rPr>
+                    <w:spacing w:val="-5"/>
+                    <w:sz w:val="21"/>
+                  </w:rPr>
+                  <w:t>2</w:t>
+                </w:r>
+                <w:r>
+                  <w:rPr>
+                    <w:spacing w:val="-5"/>
+                    <w:sz w:val="21"/>
+                  </w:rPr>
+                  <w:fldChar w:fldCharType="end"/>
+                </w:r>
+              </w:p>
+            </w:txbxContent>
+          </v:textbox>
+          <w10:wrap anchorx="page" anchory="page"/>
+        </v:rect>
+      </w:pict>
     </w:r>
   </w:p>
 </w:ftr>
 </file>
 
 <file path=word/footer3.xml><?xml version="1.0" encoding="utf-8"?>
-<w:ftr xmlns:o="urn:schemas-microsoft-com:office:office" xmlns:r="http://schemas.openxmlformats.org/officeDocument/2006/relationships" xmlns:v="urn:schemas-microsoft-com:vml" xmlns:w="http://schemas.openxmlformats.org/wordprocessingml/2006/main" xmlns:w10="urn:schemas-microsoft-com:office:word" xmlns:wp="http://schemas.openxmlformats.org/drawingml/2006/wordprocessingDrawing" xmlns:wps="http://schemas.microsoft.com/office/word/2010/wordprocessingShape" xmlns:wpg="http://schemas.microsoft.com/office/word/2010/wordprocessingGroup" xmlns:mc="http://schemas.openxmlformats.org/markup-compatibility/2006" xmlns:wp14="http://schemas.microsoft.com/office/word/2010/wordprocessingDrawing" xmlns:w14="http://schemas.microsoft.com/office/word/2010/wordml" xmlns:w15="http://schemas.microsoft.com/office/word/2012/wordml" mc:Ignorable="w14 wp14 w15">
+<w:ftr xmlns:wpc="http://schemas.microsoft.com/office/word/2010/wordprocessingCanvas" xmlns:cx="http://schemas.microsoft.com/office/drawing/2014/chartex" xmlns:cx1="http://schemas.microsoft.com/office/drawing/2015/9/8/chartex" xmlns:cx2="http://schemas.microsoft.com/office/drawing/2015/10/21/chartex" xmlns:cx3="http://schemas.microsoft.com/office/drawing/2016/5/9/chartex" xmlns:cx4="http://schemas.microsoft.com/office/drawing/2016/5/10/chartex" xmlns:cx5="http://schemas.microsoft.com/office/drawing/2016/5/11/chartex" xmlns:cx6="http://schemas.microsoft.com/office/drawing/2016/5/12/chartex" xmlns:cx7="http://schemas.microsoft.com/office/drawing/2016/5/13/chartex" xmlns:cx8="http://schemas.microsoft.com/office/drawing/2016/5/14/chartex" xmlns:mc="http://schemas.openxmlformats.org/markup-compatibility/2006" xmlns:aink="http://schemas.microsoft.com/office/drawing/2016/ink" xmlns:am3d="http://schemas.microsoft.com/office/drawing/2017/model3d" xmlns:o="urn:schemas-microsoft-com:office:office" xmlns:oel="http://schemas.microsoft.com/office/2019/extlst" xmlns:r="http://schemas.openxmlformats.org/officeDocument/2006/relationships" xmlns:m="http://schemas.openxmlformats.org/officeDocument/2006/math" xmlns:v="urn:schemas-microsoft-com:vml" xmlns:wp14="http://schemas.microsoft.com/office/word/2010/wordprocessingDrawing" xmlns:wp="http://schemas.openxmlformats.org/drawingml/2006/wordprocessingDrawing" xmlns:w10="urn:schemas-microsoft-com:office:word" xmlns:w="http://schemas.openxmlformats.org/wordprocessingml/2006/main" xmlns:w14="http://schemas.microsoft.com/office/word/2010/wordml" xmlns:w15="http://schemas.microsoft.com/office/word/2012/wordml" xmlns:w16cex="http://schemas.microsoft.com/office/word/2018/wordml/cex" xmlns:w16cid="http://schemas.microsoft.com/office/word/2016/wordml/cid" xmlns:w16="http://schemas.microsoft.com/office/word/2018/wordml" xmlns:w16du="http://schemas.microsoft.com/office/word/2023/wordml/word16du" xmlns:w16sdtdh="http://schemas.microsoft.com/office/word/2020/wordml/sdtdatahash" xmlns:w16sdtfl="http://schemas.microsoft.com/office/word/2024/wordml/sdtformatlock" xmlns:w16se="http://schemas.microsoft.com/office/word/2015/wordml/symex" xmlns:wpg="http://schemas.microsoft.com/office/word/2010/wordprocessingGroup" xmlns:wpi="http://schemas.microsoft.com/office/word/2010/wordprocessingInk" xmlns:wne="http://schemas.microsoft.com/office/word/2006/wordml" xmlns:wps="http://schemas.microsoft.com/office/word/2010/wordprocessingShape" mc:Ignorable="w14 w15 w16se w16cid w16 w16cex w16sdtdh w16sdtfl w16du wp14">
   <w:p/>
 </w:ftr>
 </file>
 
+<file path=word/footnotes.xml><?xml version="1.0" encoding="utf-8"?>
+<w:footnotes xmlns:wpc="http://schemas.microsoft.com/office/word/2010/wordprocessingCanvas" xmlns:cx="http://schemas.microsoft.com/office/drawing/2014/chartex" xmlns:cx1="http://schemas.microsoft.com/office/drawing/2015/9/8/chartex" xmlns:cx2="http://schemas.microsoft.com/office/drawing/2015/10/21/chartex" xmlns:cx3="http://schemas.microsoft.com/office/drawing/2016/5/9/chartex" xmlns:cx4="http://schemas.microsoft.com/office/drawing/2016/5/10/chartex" xmlns:cx5="http://schemas.microsoft.com/office/drawing/2016/5/11/chartex" xmlns:cx6="http://schemas.microsoft.com/office/drawing/2016/5/12/chartex" xmlns:cx7="http://schemas.microsoft.com/office/drawing/2016/5/13/chartex" xmlns:cx8="http://schemas.microsoft.com/office/drawing/2016/5/14/chartex" xmlns:mc="http://schemas.openxmlformats.org/markup-compatibility/2006" xmlns:aink="http://schemas.microsoft.com/office/drawing/2016/ink" xmlns:am3d="http://schemas.microsoft.com/office/drawing/2017/model3d" xmlns:o="urn:schemas-microsoft-com:office:office" xmlns:oel="http://schemas.microsoft.com/office/2019/extlst" xmlns:r="http://schemas.openxmlformats.org/officeDocument/2006/relationships" xmlns:m="http://schemas.openxmlformats.org/officeDocument/2006/math" xmlns:v="urn:schemas-microsoft-com:vml" xmlns:wp14="http://schemas.microsoft.com/office/word/2010/wordprocessingDrawing" xmlns:wp="http://schemas.openxmlformats.org/drawingml/2006/wordprocessingDrawing" xmlns:w10="urn:schemas-microsoft-com:office:word" xmlns:w="http://schemas.openxmlformats.org/wordprocessingml/2006/main" xmlns:w14="http://schemas.microsoft.com/office/word/2010/wordml" xmlns:w15="http://schemas.microsoft.com/office/word/2012/wordml" xmlns:w16cex="http://schemas.microsoft.com/office/word/2018/wordml/cex" xmlns:w16cid="http://schemas.microsoft.com/office/word/2016/wordml/cid" xmlns:w16="http://schemas.microsoft.com/office/word/2018/wordml" xmlns:w16du="http://schemas.microsoft.com/office/word/2023/wordml/word16du" xmlns:w16sdtdh="http://schemas.microsoft.com/office/word/2020/wordml/sdtdatahash" xmlns:w16sdtfl="http://schemas.microsoft.com/office/word/2024/wordml/sdtformatlock" xmlns:w16se="http://schemas.microsoft.com/office/word/2015/wordml/symex" xmlns:wpg="http://schemas.microsoft.com/office/word/2010/wordprocessingGroup" xmlns:wpi="http://schemas.microsoft.com/office/word/2010/wordprocessingInk" xmlns:wne="http://schemas.microsoft.com/office/word/2006/wordml" xmlns:wps="http://schemas.microsoft.com/office/word/2010/wordprocessingShape" mc:Ignorable="w14 w15 w16se w16cid w16 w16cex w16sdtdh w16sdtfl w16du wp14">
+  <w:footnote w:type="separator" w:id="-1">
+    <w:p>
+      <w:r>
+        <w:separator/>
+      </w:r>
+    </w:p>
+  </w:footnote>
+  <w:footnote w:type="continuationSeparator" w:id="0">
+    <w:p>
+      <w:r>
+        <w:continuationSeparator/>
+      </w:r>
+    </w:p>
+  </w:footnote>
+</w:footnotes>
+</file>
+
 <file path=word/numbering.xml><?xml version="1.0" encoding="utf-8"?>
-<w:numbering xmlns:w="http://schemas.openxmlformats.org/wordprocessingml/2006/main" xmlns:o="urn:schemas-microsoft-com:office:office" xmlns:r="http://schemas.openxmlformats.org/officeDocument/2006/relationships" xmlns:v="urn:schemas-microsoft-com:vml" xmlns:mc="http://schemas.openxmlformats.org/markup-compatibility/2006" xmlns:w14="http://schemas.microsoft.com/office/word/2010/wordml" mc:Ignorable="w14">
-  <w:abstractNum w:abstractNumId="1">
-    <w:lvl w:ilvl="0">
-      <w:start w:val="1"/>
-      <w:numFmt w:val="none"/>
-      <w:suff w:val="nothing"/>
-      <w:lvlText w:val="%1"/>
-      <w:lvlJc w:val="left"/>
-      <w:pPr>
-        <w:tabs>
-          <w:tab w:val="num" w:pos="0"/>
-        </w:tabs>
-        <w:ind w:left="0" w:hanging="0"/>
-      </w:pPr>
-    </w:lvl>
-    <w:lvl w:ilvl="1">
-      <w:start w:val="1"/>
-      <w:numFmt w:val="none"/>
-      <w:suff w:val="nothing"/>
-      <w:lvlText w:val="%2"/>
-      <w:lvlJc w:val="left"/>
-      <w:pPr>
-        <w:tabs>
-          <w:tab w:val="num" w:pos="0"/>
-        </w:tabs>
-        <w:ind w:left="0" w:hanging="0"/>
-      </w:pPr>
-    </w:lvl>
-    <w:lvl w:ilvl="2">
-      <w:start w:val="1"/>
-      <w:numFmt w:val="none"/>
-      <w:suff w:val="nothing"/>
-      <w:lvlText w:val="%3"/>
-      <w:lvlJc w:val="left"/>
-      <w:pPr>
-        <w:tabs>
-          <w:tab w:val="num" w:pos="0"/>
-        </w:tabs>
-        <w:ind w:left="0" w:hanging="0"/>
-      </w:pPr>
-    </w:lvl>
-    <w:lvl w:ilvl="3">
-      <w:start w:val="1"/>
-      <w:numFmt w:val="none"/>
-      <w:suff w:val="nothing"/>
-      <w:lvlText w:val="%4"/>
-      <w:lvlJc w:val="left"/>
-      <w:pPr>
-        <w:tabs>
-          <w:tab w:val="num" w:pos="0"/>
-        </w:tabs>
-        <w:ind w:left="0" w:hanging="0"/>
-      </w:pPr>
-    </w:lvl>
-    <w:lvl w:ilvl="4">
-      <w:start w:val="1"/>
-      <w:numFmt w:val="none"/>
-      <w:suff w:val="nothing"/>
-      <w:lvlText w:val="%5"/>
-      <w:lvlJc w:val="left"/>
-      <w:pPr>
-        <w:tabs>
-          <w:tab w:val="num" w:pos="0"/>
-        </w:tabs>
-        <w:ind w:left="0" w:hanging="0"/>
-      </w:pPr>
-    </w:lvl>
-    <w:lvl w:ilvl="5">
-      <w:start w:val="1"/>
-      <w:numFmt w:val="none"/>
-      <w:suff w:val="nothing"/>
-      <w:lvlText w:val="%6"/>
-      <w:lvlJc w:val="left"/>
-      <w:pPr>
-        <w:tabs>
-          <w:tab w:val="num" w:pos="0"/>
-        </w:tabs>
-        <w:ind w:left="0" w:hanging="0"/>
-      </w:pPr>
-    </w:lvl>
-    <w:lvl w:ilvl="6">
-      <w:start w:val="1"/>
-      <w:numFmt w:val="none"/>
-      <w:suff w:val="nothing"/>
-      <w:lvlText w:val="%7"/>
-      <w:lvlJc w:val="left"/>
-      <w:pPr>
-        <w:tabs>
-          <w:tab w:val="num" w:pos="0"/>
-        </w:tabs>
-        <w:ind w:left="0" w:hanging="0"/>
-      </w:pPr>
-    </w:lvl>
-    <w:lvl w:ilvl="7">
-      <w:start w:val="1"/>
-      <w:numFmt w:val="none"/>
-      <w:suff w:val="nothing"/>
-      <w:lvlText w:val="%8"/>
-      <w:lvlJc w:val="left"/>
-      <w:pPr>
-        <w:tabs>
-          <w:tab w:val="num" w:pos="0"/>
-        </w:tabs>
-        <w:ind w:left="0" w:hanging="0"/>
-      </w:pPr>
-    </w:lvl>
-    <w:lvl w:ilvl="8">
-      <w:start w:val="1"/>
-      <w:numFmt w:val="none"/>
-      <w:suff w:val="nothing"/>
-      <w:lvlText w:val="%9"/>
-      <w:lvlJc w:val="left"/>
-      <w:pPr>
-        <w:tabs>
-          <w:tab w:val="num" w:pos="0"/>
-        </w:tabs>
-        <w:ind w:left="0" w:hanging="0"/>
-      </w:pPr>
-    </w:lvl>
-  </w:abstractNum>
-  <w:abstractNum w:abstractNumId="2">
+<w:numbering xmlns:wpc="http://schemas.microsoft.com/office/word/2010/wordprocessingCanvas" xmlns:cx="http://schemas.microsoft.com/office/drawing/2014/chartex" xmlns:cx1="http://schemas.microsoft.com/office/drawing/2015/9/8/chartex" xmlns:cx2="http://schemas.microsoft.com/office/drawing/2015/10/21/chartex" xmlns:cx3="http://schemas.microsoft.com/office/drawing/2016/5/9/chartex" xmlns:cx4="http://schemas.microsoft.com/office/drawing/2016/5/10/chartex" xmlns:cx5="http://schemas.microsoft.com/office/drawing/2016/5/11/chartex" xmlns:cx6="http://schemas.microsoft.com/office/drawing/2016/5/12/chartex" xmlns:cx7="http://schemas.microsoft.com/office/drawing/2016/5/13/chartex" xmlns:cx8="http://schemas.microsoft.com/office/drawing/2016/5/14/chartex" xmlns:mc="http://schemas.openxmlformats.org/markup-compatibility/2006" xmlns:aink="http://schemas.microsoft.com/office/drawing/2016/ink" xmlns:am3d="http://schemas.microsoft.com/office/drawing/2017/model3d" xmlns:o="urn:schemas-microsoft-com:office:office" xmlns:oel="http://schemas.microsoft.com/office/2019/extlst" xmlns:r="http://schemas.openxmlformats.org/officeDocument/2006/relationships" xmlns:m="http://schemas.openxmlformats.org/officeDocument/2006/math" xmlns:v="urn:schemas-microsoft-com:vml" xmlns:wp14="http://schemas.microsoft.com/office/word/2010/wordprocessingDrawing" xmlns:wp="http://schemas.openxmlformats.org/drawingml/2006/wordprocessingDrawing" xmlns:w10="urn:schemas-microsoft-com:office:word" xmlns:w="http://schemas.openxmlformats.org/wordprocessingml/2006/main" xmlns:w14="http://schemas.microsoft.com/office/word/2010/wordml" xmlns:w15="http://schemas.microsoft.com/office/word/2012/wordml" xmlns:w16cex="http://schemas.microsoft.com/office/word/2018/wordml/cex" xmlns:w16cid="http://schemas.microsoft.com/office/word/2016/wordml/cid" xmlns:w16="http://schemas.microsoft.com/office/word/2018/wordml" xmlns:w16du="http://schemas.microsoft.com/office/word/2023/wordml/word16du" xmlns:w16sdtdh="http://schemas.microsoft.com/office/word/2020/wordml/sdtdatahash" xmlns:w16sdtfl="http://schemas.microsoft.com/office/word/2024/wordml/sdtformatlock" xmlns:w16se="http://schemas.microsoft.com/office/word/2015/wordml/symex" xmlns:wpg="http://schemas.microsoft.com/office/word/2010/wordprocessingGroup" xmlns:wpi="http://schemas.microsoft.com/office/word/2010/wordprocessingInk" xmlns:wne="http://schemas.microsoft.com/office/word/2006/wordml" xmlns:wps="http://schemas.microsoft.com/office/word/2010/wordprocessingShape" mc:Ignorable="w14 w15 w16se w16cid w16 w16cex w16sdtdh w16sdtfl w16du wp14">
+  <w:abstractNum w:abstractNumId="0" w15:restartNumberingAfterBreak="0">
+    <w:nsid w:val="0B991CFC"/>
+    <w:multiLevelType w:val="multilevel"/>
+    <w:tmpl w:val="591AB71C"/>
     <w:lvl w:ilvl="0">
       <w:start w:val="11"/>
       <w:numFmt w:val="decimal"/>
@@ -3300,15 +3374,15 @@
         <w:ind w:left="640" w:hanging="420"/>
       </w:pPr>
       <w:rPr>
+        <w:rFonts w:ascii="Calibri" w:eastAsia="Calibri" w:hAnsi="Calibri" w:cs="Calibri"/>
+        <w:b/>
+        <w:bCs/>
+        <w:i w:val="0"/>
+        <w:iCs w:val="0"/>
+        <w:spacing w:val="-2"/>
+        <w:w w:val="100"/>
         <w:sz w:val="28"/>
-        <w:spacing w:val="-2"/>
-        <w:i w:val="false"/>
-        <w:b/>
         <w:szCs w:val="28"/>
-        <w:iCs w:val="false"/>
-        <w:bCs/>
-        <w:w w:val="100"/>
-        <w:rFonts w:ascii="Calibri" w:hAnsi="Calibri" w:eastAsia="Calibri" w:cs="Calibri"/>
         <w:lang w:val="en-US" w:eastAsia="en-US" w:bidi="ar-SA"/>
       </w:rPr>
     </w:lvl>
@@ -3325,14 +3399,14 @@
       </w:pPr>
       <w:rPr>
         <w:rFonts w:ascii="Calibri" w:hAnsi="Calibri" w:cs="Calibri" w:hint="default"/>
+        <w:b w:val="0"/>
+        <w:bCs w:val="0"/>
+        <w:i w:val="0"/>
+        <w:iCs w:val="0"/>
+        <w:spacing w:val="0"/>
+        <w:w w:val="100"/>
         <w:sz w:val="22"/>
-        <w:spacing w:val="0"/>
-        <w:i w:val="false"/>
-        <w:b w:val="false"/>
         <w:szCs w:val="22"/>
-        <w:iCs w:val="false"/>
-        <w:bCs w:val="false"/>
-        <w:w w:val="100"/>
         <w:lang w:val="en-US" w:eastAsia="en-US" w:bidi="ar-SA"/>
       </w:rPr>
     </w:lvl>
@@ -3449,21 +3523,143 @@
       </w:rPr>
     </w:lvl>
   </w:abstractNum>
-  <w:num w:numId="1">
+  <w:abstractNum w:abstractNumId="1" w15:restartNumberingAfterBreak="0">
+    <w:nsid w:val="19C42F17"/>
+    <w:multiLevelType w:val="multilevel"/>
+    <w:tmpl w:val="0C28E0FE"/>
+    <w:lvl w:ilvl="0">
+      <w:start w:val="1"/>
+      <w:numFmt w:val="none"/>
+      <w:suff w:val="nothing"/>
+      <w:lvlText w:val="%1"/>
+      <w:lvlJc w:val="left"/>
+      <w:pPr>
+        <w:tabs>
+          <w:tab w:val="num" w:pos="0"/>
+        </w:tabs>
+        <w:ind w:left="0" w:firstLine="0"/>
+      </w:pPr>
+    </w:lvl>
+    <w:lvl w:ilvl="1">
+      <w:start w:val="1"/>
+      <w:numFmt w:val="none"/>
+      <w:suff w:val="nothing"/>
+      <w:lvlText w:val="%2"/>
+      <w:lvlJc w:val="left"/>
+      <w:pPr>
+        <w:tabs>
+          <w:tab w:val="num" w:pos="0"/>
+        </w:tabs>
+        <w:ind w:left="0" w:firstLine="0"/>
+      </w:pPr>
+    </w:lvl>
+    <w:lvl w:ilvl="2">
+      <w:start w:val="1"/>
+      <w:numFmt w:val="none"/>
+      <w:suff w:val="nothing"/>
+      <w:lvlText w:val="%3"/>
+      <w:lvlJc w:val="left"/>
+      <w:pPr>
+        <w:tabs>
+          <w:tab w:val="num" w:pos="0"/>
+        </w:tabs>
+        <w:ind w:left="0" w:firstLine="0"/>
+      </w:pPr>
+    </w:lvl>
+    <w:lvl w:ilvl="3">
+      <w:start w:val="1"/>
+      <w:numFmt w:val="none"/>
+      <w:suff w:val="nothing"/>
+      <w:lvlText w:val="%4"/>
+      <w:lvlJc w:val="left"/>
+      <w:pPr>
+        <w:tabs>
+          <w:tab w:val="num" w:pos="0"/>
+        </w:tabs>
+        <w:ind w:left="0" w:firstLine="0"/>
+      </w:pPr>
+    </w:lvl>
+    <w:lvl w:ilvl="4">
+      <w:start w:val="1"/>
+      <w:numFmt w:val="none"/>
+      <w:suff w:val="nothing"/>
+      <w:lvlText w:val="%5"/>
+      <w:lvlJc w:val="left"/>
+      <w:pPr>
+        <w:tabs>
+          <w:tab w:val="num" w:pos="0"/>
+        </w:tabs>
+        <w:ind w:left="0" w:firstLine="0"/>
+      </w:pPr>
+    </w:lvl>
+    <w:lvl w:ilvl="5">
+      <w:start w:val="1"/>
+      <w:numFmt w:val="none"/>
+      <w:suff w:val="nothing"/>
+      <w:lvlText w:val="%6"/>
+      <w:lvlJc w:val="left"/>
+      <w:pPr>
+        <w:tabs>
+          <w:tab w:val="num" w:pos="0"/>
+        </w:tabs>
+        <w:ind w:left="0" w:firstLine="0"/>
+      </w:pPr>
+    </w:lvl>
+    <w:lvl w:ilvl="6">
+      <w:start w:val="1"/>
+      <w:numFmt w:val="none"/>
+      <w:suff w:val="nothing"/>
+      <w:lvlText w:val="%7"/>
+      <w:lvlJc w:val="left"/>
+      <w:pPr>
+        <w:tabs>
+          <w:tab w:val="num" w:pos="0"/>
+        </w:tabs>
+        <w:ind w:left="0" w:firstLine="0"/>
+      </w:pPr>
+    </w:lvl>
+    <w:lvl w:ilvl="7">
+      <w:start w:val="1"/>
+      <w:numFmt w:val="none"/>
+      <w:suff w:val="nothing"/>
+      <w:lvlText w:val="%8"/>
+      <w:lvlJc w:val="left"/>
+      <w:pPr>
+        <w:tabs>
+          <w:tab w:val="num" w:pos="0"/>
+        </w:tabs>
+        <w:ind w:left="0" w:firstLine="0"/>
+      </w:pPr>
+    </w:lvl>
+    <w:lvl w:ilvl="8">
+      <w:start w:val="1"/>
+      <w:numFmt w:val="none"/>
+      <w:suff w:val="nothing"/>
+      <w:lvlText w:val="%9"/>
+      <w:lvlJc w:val="left"/>
+      <w:pPr>
+        <w:tabs>
+          <w:tab w:val="num" w:pos="0"/>
+        </w:tabs>
+        <w:ind w:left="0" w:firstLine="0"/>
+      </w:pPr>
+    </w:lvl>
+  </w:abstractNum>
+  <w:num w:numId="1" w16cid:durableId="294410031">
     <w:abstractNumId w:val="1"/>
   </w:num>
-  <w:num w:numId="2">
-    <w:abstractNumId w:val="2"/>
+  <w:num w:numId="2" w16cid:durableId="1554267886">
+    <w:abstractNumId w:val="0"/>
   </w:num>
 </w:numbering>
 </file>
 
 <file path=word/styles.xml><?xml version="1.0" encoding="utf-8"?>
-<w:styles xmlns:w="http://schemas.openxmlformats.org/wordprocessingml/2006/main" xmlns:w14="http://schemas.microsoft.com/office/word/2010/wordml" xmlns:mc="http://schemas.openxmlformats.org/markup-compatibility/2006" mc:Ignorable="w14">
+<w:styles xmlns:mc="http://schemas.openxmlformats.org/markup-compatibility/2006" xmlns:r="http://schemas.openxmlformats.org/officeDocument/2006/relationships" xmlns:w="http://schemas.openxmlformats.org/wordprocessingml/2006/main" xmlns:w14="http://schemas.microsoft.com/office/word/2010/wordml" xmlns:w15="http://schemas.microsoft.com/office/word/2012/wordml" xmlns:w16cex="http://schemas.microsoft.com/office/word/2018/wordml/cex" xmlns:w16cid="http://schemas.microsoft.com/office/word/2016/wordml/cid" xmlns:w16="http://schemas.microsoft.com/office/word/2018/wordml" xmlns:w16du="http://schemas.microsoft.com/office/word/2023/wordml/word16du" xmlns:w16sdtdh="http://schemas.microsoft.com/office/word/2020/wordml/sdtdatahash" xmlns:w16sdtfl="http://schemas.microsoft.com/office/word/2024/wordml/sdtformatlock" xmlns:w16se="http://schemas.microsoft.com/office/word/2015/wordml/symex" mc:Ignorable="w14 w15 w16se w16cid w16 w16cex w16sdtdh w16sdtfl w16du">
   <w:docDefaults>
     <w:rPrDefault>
       <w:rPr>
-        <w:rFonts w:ascii="Calibri" w:hAnsi="Calibri" w:eastAsia="Calibri" w:cs="DejaVu Sans"/>
+        <w:rFonts w:ascii="Calibri" w:eastAsia="Calibri" w:hAnsi="Calibri" w:cs="DejaVu Sans"/>
         <w:sz w:val="22"/>
         <w:szCs w:val="22"/>
         <w:lang w:val="en-US" w:eastAsia="en-US" w:bidi="ar-SA"/>
@@ -3471,111 +3667,489 @@
     </w:rPrDefault>
     <w:pPrDefault>
       <w:pPr>
-        <w:suppressAutoHyphens w:val="true"/>
+        <w:suppressAutoHyphens/>
       </w:pPr>
     </w:pPrDefault>
   </w:docDefaults>
-  <w:style w:type="paragraph" w:styleId="Normal">
+  <w:latentStyles w:defLockedState="0" w:defUIPriority="99" w:defSemiHidden="0" w:defUnhideWhenUsed="0" w:defQFormat="0" w:count="376">
+    <w:lsdException w:name="Normal" w:uiPriority="0" w:qFormat="1"/>
+    <w:lsdException w:name="heading 1" w:uiPriority="9" w:qFormat="1"/>
+    <w:lsdException w:name="heading 2" w:semiHidden="1" w:uiPriority="9" w:unhideWhenUsed="1" w:qFormat="1"/>
+    <w:lsdException w:name="heading 3" w:semiHidden="1" w:uiPriority="9" w:unhideWhenUsed="1" w:qFormat="1"/>
+    <w:lsdException w:name="heading 4" w:semiHidden="1" w:uiPriority="9" w:unhideWhenUsed="1" w:qFormat="1"/>
+    <w:lsdException w:name="heading 5" w:semiHidden="1" w:uiPriority="9" w:unhideWhenUsed="1" w:qFormat="1"/>
+    <w:lsdException w:name="heading 6" w:semiHidden="1" w:uiPriority="9" w:unhideWhenUsed="1" w:qFormat="1"/>
+    <w:lsdException w:name="heading 7" w:semiHidden="1" w:uiPriority="9" w:unhideWhenUsed="1" w:qFormat="1"/>
+    <w:lsdException w:name="heading 8" w:semiHidden="1" w:uiPriority="9" w:unhideWhenUsed="1" w:qFormat="1"/>
+    <w:lsdException w:name="heading 9" w:semiHidden="1" w:uiPriority="9" w:unhideWhenUsed="1" w:qFormat="1"/>
+    <w:lsdException w:name="index 1" w:semiHidden="1" w:unhideWhenUsed="1"/>
+    <w:lsdException w:name="index 2" w:semiHidden="1" w:unhideWhenUsed="1"/>
+    <w:lsdException w:name="index 3" w:semiHidden="1" w:unhideWhenUsed="1"/>
+    <w:lsdException w:name="index 4" w:semiHidden="1" w:unhideWhenUsed="1"/>
+    <w:lsdException w:name="index 5" w:semiHidden="1" w:unhideWhenUsed="1"/>
+    <w:lsdException w:name="index 6" w:semiHidden="1" w:unhideWhenUsed="1"/>
+    <w:lsdException w:name="index 7" w:semiHidden="1" w:unhideWhenUsed="1"/>
+    <w:lsdException w:name="index 8" w:semiHidden="1" w:unhideWhenUsed="1"/>
+    <w:lsdException w:name="index 9" w:semiHidden="1" w:unhideWhenUsed="1"/>
+    <w:lsdException w:name="toc 1" w:semiHidden="1" w:uiPriority="39" w:unhideWhenUsed="1"/>
+    <w:lsdException w:name="toc 2" w:semiHidden="1" w:uiPriority="39" w:unhideWhenUsed="1"/>
+    <w:lsdException w:name="toc 3" w:semiHidden="1" w:uiPriority="39" w:unhideWhenUsed="1"/>
+    <w:lsdException w:name="toc 4" w:semiHidden="1" w:uiPriority="39" w:unhideWhenUsed="1"/>
+    <w:lsdException w:name="toc 5" w:semiHidden="1" w:uiPriority="39" w:unhideWhenUsed="1"/>
+    <w:lsdException w:name="toc 6" w:semiHidden="1" w:uiPriority="39" w:unhideWhenUsed="1"/>
+    <w:lsdException w:name="toc 7" w:semiHidden="1" w:uiPriority="39" w:unhideWhenUsed="1"/>
+    <w:lsdException w:name="toc 8" w:semiHidden="1" w:uiPriority="39" w:unhideWhenUsed="1"/>
+    <w:lsdException w:name="toc 9" w:semiHidden="1" w:uiPriority="39" w:unhideWhenUsed="1"/>
+    <w:lsdException w:name="Normal Indent" w:semiHidden="1" w:unhideWhenUsed="1"/>
+    <w:lsdException w:name="footnote text" w:semiHidden="1" w:unhideWhenUsed="1"/>
+    <w:lsdException w:name="annotation text" w:semiHidden="1" w:unhideWhenUsed="1"/>
+    <w:lsdException w:name="header" w:semiHidden="1" w:unhideWhenUsed="1"/>
+    <w:lsdException w:name="footer" w:semiHidden="1" w:unhideWhenUsed="1"/>
+    <w:lsdException w:name="index heading" w:semiHidden="1" w:unhideWhenUsed="1"/>
+    <w:lsdException w:name="caption" w:semiHidden="1" w:uiPriority="35" w:unhideWhenUsed="1" w:qFormat="1"/>
+    <w:lsdException w:name="table of figures" w:semiHidden="1" w:unhideWhenUsed="1"/>
+    <w:lsdException w:name="envelope address" w:semiHidden="1" w:unhideWhenUsed="1"/>
+    <w:lsdException w:name="envelope return" w:semiHidden="1" w:unhideWhenUsed="1"/>
+    <w:lsdException w:name="footnote reference" w:semiHidden="1" w:unhideWhenUsed="1"/>
+    <w:lsdException w:name="annotation reference" w:semiHidden="1" w:unhideWhenUsed="1"/>
+    <w:lsdException w:name="line number" w:semiHidden="1" w:unhideWhenUsed="1"/>
+    <w:lsdException w:name="page number" w:semiHidden="1" w:unhideWhenUsed="1"/>
+    <w:lsdException w:name="endnote reference" w:semiHidden="1" w:unhideWhenUsed="1"/>
+    <w:lsdException w:name="endnote text" w:semiHidden="1" w:unhideWhenUsed="1"/>
+    <w:lsdException w:name="table of authorities" w:semiHidden="1" w:unhideWhenUsed="1"/>
+    <w:lsdException w:name="macro" w:semiHidden="1" w:unhideWhenUsed="1"/>
+    <w:lsdException w:name="toa heading" w:semiHidden="1" w:unhideWhenUsed="1"/>
+    <w:lsdException w:name="List" w:semiHidden="1" w:unhideWhenUsed="1"/>
+    <w:lsdException w:name="List Bullet" w:semiHidden="1" w:unhideWhenUsed="1"/>
+    <w:lsdException w:name="List Number" w:semiHidden="1" w:unhideWhenUsed="1"/>
+    <w:lsdException w:name="List 2" w:semiHidden="1" w:unhideWhenUsed="1"/>
+    <w:lsdException w:name="List 3" w:semiHidden="1" w:unhideWhenUsed="1"/>
+    <w:lsdException w:name="List 4" w:semiHidden="1" w:unhideWhenUsed="1"/>
+    <w:lsdException w:name="List 5" w:semiHidden="1" w:unhideWhenUsed="1"/>
+    <w:lsdException w:name="List Bullet 2" w:semiHidden="1" w:unhideWhenUsed="1"/>
+    <w:lsdException w:name="List Bullet 3" w:semiHidden="1" w:unhideWhenUsed="1"/>
+    <w:lsdException w:name="List Bullet 4" w:semiHidden="1" w:unhideWhenUsed="1"/>
+    <w:lsdException w:name="List Bullet 5" w:semiHidden="1" w:unhideWhenUsed="1"/>
+    <w:lsdException w:name="List Number 2" w:semiHidden="1" w:unhideWhenUsed="1"/>
+    <w:lsdException w:name="List Number 3" w:semiHidden="1" w:unhideWhenUsed="1"/>
+    <w:lsdException w:name="List Number 4" w:semiHidden="1" w:unhideWhenUsed="1"/>
+    <w:lsdException w:name="List Number 5" w:semiHidden="1" w:unhideWhenUsed="1"/>
+    <w:lsdException w:name="Title" w:uiPriority="10" w:qFormat="1"/>
+    <w:lsdException w:name="Closing" w:semiHidden="1" w:unhideWhenUsed="1"/>
+    <w:lsdException w:name="Signature" w:semiHidden="1" w:unhideWhenUsed="1"/>
+    <w:lsdException w:name="Default Paragraph Font" w:semiHidden="1" w:uiPriority="1" w:unhideWhenUsed="1"/>
+    <w:lsdException w:name="Body Text" w:semiHidden="1" w:unhideWhenUsed="1"/>
+    <w:lsdException w:name="Body Text Indent" w:semiHidden="1" w:unhideWhenUsed="1"/>
+    <w:lsdException w:name="List Continue" w:semiHidden="1" w:unhideWhenUsed="1"/>
+    <w:lsdException w:name="List Continue 2" w:semiHidden="1" w:unhideWhenUsed="1"/>
+    <w:lsdException w:name="List Continue 3" w:semiHidden="1" w:unhideWhenUsed="1"/>
+    <w:lsdException w:name="List Continue 4" w:semiHidden="1" w:unhideWhenUsed="1"/>
+    <w:lsdException w:name="List Continue 5" w:semiHidden="1" w:unhideWhenUsed="1"/>
+    <w:lsdException w:name="Message Header" w:semiHidden="1" w:unhideWhenUsed="1"/>
+    <w:lsdException w:name="Subtitle" w:uiPriority="11" w:qFormat="1"/>
+    <w:lsdException w:name="Salutation" w:semiHidden="1" w:unhideWhenUsed="1"/>
+    <w:lsdException w:name="Date" w:semiHidden="1" w:unhideWhenUsed="1"/>
+    <w:lsdException w:name="Body Text First Indent" w:semiHidden="1" w:unhideWhenUsed="1"/>
+    <w:lsdException w:name="Body Text First Indent 2" w:semiHidden="1" w:unhideWhenUsed="1"/>
+    <w:lsdException w:name="Note Heading" w:semiHidden="1" w:unhideWhenUsed="1"/>
+    <w:lsdException w:name="Body Text 2" w:semiHidden="1" w:unhideWhenUsed="1"/>
+    <w:lsdException w:name="Body Text 3" w:semiHidden="1" w:unhideWhenUsed="1"/>
+    <w:lsdException w:name="Body Text Indent 2" w:semiHidden="1" w:unhideWhenUsed="1"/>
+    <w:lsdException w:name="Body Text Indent 3" w:semiHidden="1" w:unhideWhenUsed="1"/>
+    <w:lsdException w:name="Block Text" w:semiHidden="1" w:unhideWhenUsed="1"/>
+    <w:lsdException w:name="Hyperlink" w:semiHidden="1" w:unhideWhenUsed="1"/>
+    <w:lsdException w:name="FollowedHyperlink" w:semiHidden="1" w:unhideWhenUsed="1"/>
+    <w:lsdException w:name="Strong" w:uiPriority="22" w:qFormat="1"/>
+    <w:lsdException w:name="Emphasis" w:uiPriority="20" w:qFormat="1"/>
+    <w:lsdException w:name="Document Map" w:semiHidden="1" w:unhideWhenUsed="1"/>
+    <w:lsdException w:name="Plain Text" w:semiHidden="1" w:unhideWhenUsed="1"/>
+    <w:lsdException w:name="E-mail Signature" w:semiHidden="1" w:unhideWhenUsed="1"/>
+    <w:lsdException w:name="HTML Top of Form" w:semiHidden="1" w:unhideWhenUsed="1"/>
+    <w:lsdException w:name="HTML Bottom of Form" w:semiHidden="1" w:unhideWhenUsed="1"/>
+    <w:lsdException w:name="Normal (Web)" w:semiHidden="1" w:unhideWhenUsed="1"/>
+    <w:lsdException w:name="HTML Acronym" w:semiHidden="1" w:unhideWhenUsed="1"/>
+    <w:lsdException w:name="HTML Address" w:semiHidden="1" w:unhideWhenUsed="1"/>
+    <w:lsdException w:name="HTML Cite" w:semiHidden="1" w:unhideWhenUsed="1"/>
+    <w:lsdException w:name="HTML Code" w:semiHidden="1" w:unhideWhenUsed="1"/>
+    <w:lsdException w:name="HTML Definition" w:semiHidden="1" w:unhideWhenUsed="1"/>
+    <w:lsdException w:name="HTML Keyboard" w:semiHidden="1" w:unhideWhenUsed="1"/>
+    <w:lsdException w:name="HTML Preformatted" w:semiHidden="1" w:unhideWhenUsed="1"/>
+    <w:lsdException w:name="HTML Sample" w:semiHidden="1" w:unhideWhenUsed="1"/>
+    <w:lsdException w:name="HTML Typewriter" w:semiHidden="1" w:unhideWhenUsed="1"/>
+    <w:lsdException w:name="HTML Variable" w:semiHidden="1" w:unhideWhenUsed="1"/>
+    <w:lsdException w:name="Normal Table" w:semiHidden="1" w:unhideWhenUsed="1"/>
+    <w:lsdException w:name="annotation subject" w:semiHidden="1" w:unhideWhenUsed="1"/>
+    <w:lsdException w:name="No List" w:semiHidden="1" w:unhideWhenUsed="1"/>
+    <w:lsdException w:name="Outline List 1" w:semiHidden="1" w:unhideWhenUsed="1"/>
+    <w:lsdException w:name="Outline List 2" w:semiHidden="1" w:unhideWhenUsed="1"/>
+    <w:lsdException w:name="Outline List 3" w:semiHidden="1" w:unhideWhenUsed="1"/>
+    <w:lsdException w:name="Table Simple 1" w:semiHidden="1" w:unhideWhenUsed="1"/>
+    <w:lsdException w:name="Table Simple 2" w:semiHidden="1" w:unhideWhenUsed="1"/>
+    <w:lsdException w:name="Table Simple 3" w:semiHidden="1" w:unhideWhenUsed="1"/>
+    <w:lsdException w:name="Table Classic 1" w:semiHidden="1" w:unhideWhenUsed="1"/>
+    <w:lsdException w:name="Table Classic 2" w:semiHidden="1" w:unhideWhenUsed="1"/>
+    <w:lsdException w:name="Table Classic 3" w:semiHidden="1" w:unhideWhenUsed="1"/>
+    <w:lsdException w:name="Table Classic 4" w:semiHidden="1" w:unhideWhenUsed="1"/>
+    <w:lsdException w:name="Table Colorful 1" w:semiHidden="1" w:unhideWhenUsed="1"/>
+    <w:lsdException w:name="Table Colorful 2" w:semiHidden="1" w:unhideWhenUsed="1"/>
+    <w:lsdException w:name="Table Colorful 3" w:semiHidden="1" w:unhideWhenUsed="1"/>
+    <w:lsdException w:name="Table Columns 1" w:semiHidden="1" w:unhideWhenUsed="1"/>
+    <w:lsdException w:name="Table Columns 2" w:semiHidden="1" w:unhideWhenUsed="1"/>
+    <w:lsdException w:name="Table Columns 3" w:semiHidden="1" w:unhideWhenUsed="1"/>
+    <w:lsdException w:name="Table Columns 4" w:semiHidden="1" w:unhideWhenUsed="1"/>
+    <w:lsdException w:name="Table Columns 5" w:semiHidden="1" w:unhideWhenUsed="1"/>
+    <w:lsdException w:name="Table Grid 1" w:semiHidden="1" w:unhideWhenUsed="1"/>
+    <w:lsdException w:name="Table Grid 2" w:semiHidden="1" w:unhideWhenUsed="1"/>
+    <w:lsdException w:name="Table Grid 3" w:semiHidden="1" w:unhideWhenUsed="1"/>
+    <w:lsdException w:name="Table Grid 4" w:semiHidden="1" w:unhideWhenUsed="1"/>
+    <w:lsdException w:name="Table Grid 5" w:semiHidden="1" w:unhideWhenUsed="1"/>
+    <w:lsdException w:name="Table Grid 6" w:semiHidden="1" w:unhideWhenUsed="1"/>
+    <w:lsdException w:name="Table Grid 7" w:semiHidden="1" w:unhideWhenUsed="1"/>
+    <w:lsdException w:name="Table Grid 8" w:semiHidden="1" w:unhideWhenUsed="1"/>
+    <w:lsdException w:name="Table List 1" w:semiHidden="1" w:unhideWhenUsed="1"/>
+    <w:lsdException w:name="Table List 2" w:semiHidden="1" w:unhideWhenUsed="1"/>
+    <w:lsdException w:name="Table List 3" w:semiHidden="1" w:unhideWhenUsed="1"/>
+    <w:lsdException w:name="Table List 4" w:semiHidden="1" w:unhideWhenUsed="1"/>
+    <w:lsdException w:name="Table List 5" w:semiHidden="1" w:unhideWhenUsed="1"/>
+    <w:lsdException w:name="Table List 6" w:semiHidden="1" w:unhideWhenUsed="1"/>
+    <w:lsdException w:name="Table List 7" w:semiHidden="1" w:unhideWhenUsed="1"/>
+    <w:lsdException w:name="Table List 8" w:semiHidden="1" w:unhideWhenUsed="1"/>
+    <w:lsdException w:name="Table 3D effects 1" w:semiHidden="1" w:unhideWhenUsed="1"/>
+    <w:lsdException w:name="Table 3D effects 2" w:semiHidden="1" w:unhideWhenUsed="1"/>
+    <w:lsdException w:name="Table 3D effects 3" w:semiHidden="1" w:unhideWhenUsed="1"/>
+    <w:lsdException w:name="Table Contemporary" w:semiHidden="1" w:unhideWhenUsed="1"/>
+    <w:lsdException w:name="Table Elegant" w:semiHidden="1" w:unhideWhenUsed="1"/>
+    <w:lsdException w:name="Table Professional" w:semiHidden="1" w:unhideWhenUsed="1"/>
+    <w:lsdException w:name="Table Subtle 1" w:semiHidden="1" w:unhideWhenUsed="1"/>
+    <w:lsdException w:name="Table Subtle 2" w:semiHidden="1" w:unhideWhenUsed="1"/>
+    <w:lsdException w:name="Table Web 1" w:semiHidden="1" w:unhideWhenUsed="1"/>
+    <w:lsdException w:name="Table Web 2" w:semiHidden="1" w:unhideWhenUsed="1"/>
+    <w:lsdException w:name="Table Web 3" w:semiHidden="1" w:unhideWhenUsed="1"/>
+    <w:lsdException w:name="Balloon Text" w:semiHidden="1" w:unhideWhenUsed="1"/>
+    <w:lsdException w:name="Table Grid" w:uiPriority="39"/>
+    <w:lsdException w:name="Table Theme" w:semiHidden="1" w:unhideWhenUsed="1"/>
+    <w:lsdException w:name="Placeholder Text" w:semiHidden="1"/>
+    <w:lsdException w:name="No Spacing" w:uiPriority="1" w:qFormat="1"/>
+    <w:lsdException w:name="Light Shading" w:uiPriority="60"/>
+    <w:lsdException w:name="Light List" w:uiPriority="61"/>
+    <w:lsdException w:name="Light Grid" w:uiPriority="62"/>
+    <w:lsdException w:name="Medium Shading 1" w:uiPriority="63"/>
+    <w:lsdException w:name="Medium Shading 2" w:uiPriority="64"/>
+    <w:lsdException w:name="Medium List 1" w:uiPriority="65"/>
+    <w:lsdException w:name="Medium List 2" w:uiPriority="66"/>
+    <w:lsdException w:name="Medium Grid 1" w:uiPriority="67"/>
+    <w:lsdException w:name="Medium Grid 2" w:uiPriority="68"/>
+    <w:lsdException w:name="Medium Grid 3" w:uiPriority="69"/>
+    <w:lsdException w:name="Dark List" w:uiPriority="70"/>
+    <w:lsdException w:name="Colorful Shading" w:uiPriority="71"/>
+    <w:lsdException w:name="Colorful List" w:uiPriority="72"/>
+    <w:lsdException w:name="Colorful Grid" w:uiPriority="73"/>
+    <w:lsdException w:name="Light Shading Accent 1" w:uiPriority="60"/>
+    <w:lsdException w:name="Light List Accent 1" w:uiPriority="61"/>
+    <w:lsdException w:name="Light Grid Accent 1" w:uiPriority="62"/>
+    <w:lsdException w:name="Medium Shading 1 Accent 1" w:uiPriority="63"/>
+    <w:lsdException w:name="Medium Shading 2 Accent 1" w:uiPriority="64"/>
+    <w:lsdException w:name="Medium List 1 Accent 1" w:uiPriority="65"/>
+    <w:lsdException w:name="Revision" w:semiHidden="1"/>
+    <w:lsdException w:name="List Paragraph" w:uiPriority="34" w:qFormat="1"/>
+    <w:lsdException w:name="Quote" w:uiPriority="29" w:qFormat="1"/>
+    <w:lsdException w:name="Intense Quote" w:uiPriority="30" w:qFormat="1"/>
+    <w:lsdException w:name="Medium List 2 Accent 1" w:uiPriority="66"/>
+    <w:lsdException w:name="Medium Grid 1 Accent 1" w:uiPriority="67"/>
+    <w:lsdException w:name="Medium Grid 2 Accent 1" w:uiPriority="68"/>
+    <w:lsdException w:name="Medium Grid 3 Accent 1" w:uiPriority="69"/>
+    <w:lsdException w:name="Dark List Accent 1" w:uiPriority="70"/>
+    <w:lsdException w:name="Colorful Shading Accent 1" w:uiPriority="71"/>
+    <w:lsdException w:name="Colorful List Accent 1" w:uiPriority="72"/>
+    <w:lsdException w:name="Colorful Grid Accent 1" w:uiPriority="73"/>
+    <w:lsdException w:name="Light Shading Accent 2" w:uiPriority="60"/>
+    <w:lsdException w:name="Light List Accent 2" w:uiPriority="61"/>
+    <w:lsdException w:name="Light Grid Accent 2" w:uiPriority="62"/>
+    <w:lsdException w:name="Medium Shading 1 Accent 2" w:uiPriority="63"/>
+    <w:lsdException w:name="Medium Shading 2 Accent 2" w:uiPriority="64"/>
+    <w:lsdException w:name="Medium List 1 Accent 2" w:uiPriority="65"/>
+    <w:lsdException w:name="Medium List 2 Accent 2" w:uiPriority="66"/>
+    <w:lsdException w:name="Medium Grid 1 Accent 2" w:uiPriority="67"/>
+    <w:lsdException w:name="Medium Grid 2 Accent 2" w:uiPriority="68"/>
+    <w:lsdException w:name="Medium Grid 3 Accent 2" w:uiPriority="69"/>
+    <w:lsdException w:name="Dark List Accent 2" w:uiPriority="70"/>
+    <w:lsdException w:name="Colorful Shading Accent 2" w:uiPriority="71"/>
+    <w:lsdException w:name="Colorful List Accent 2" w:uiPriority="72"/>
+    <w:lsdException w:name="Colorful Grid Accent 2" w:uiPriority="73"/>
+    <w:lsdException w:name="Light Shading Accent 3" w:uiPriority="60"/>
+    <w:lsdException w:name="Light List Accent 3" w:uiPriority="61"/>
+    <w:lsdException w:name="Light Grid Accent 3" w:uiPriority="62"/>
+    <w:lsdException w:name="Medium Shading 1 Accent 3" w:uiPriority="63"/>
+    <w:lsdException w:name="Medium Shading 2 Accent 3" w:uiPriority="64"/>
+    <w:lsdException w:name="Medium List 1 Accent 3" w:uiPriority="65"/>
+    <w:lsdException w:name="Medium List 2 Accent 3" w:uiPriority="66"/>
+    <w:lsdException w:name="Medium Grid 1 Accent 3" w:uiPriority="67"/>
+    <w:lsdException w:name="Medium Grid 2 Accent 3" w:uiPriority="68"/>
+    <w:lsdException w:name="Medium Grid 3 Accent 3" w:uiPriority="69"/>
+    <w:lsdException w:name="Dark List Accent 3" w:uiPriority="70"/>
+    <w:lsdException w:name="Colorful Shading Accent 3" w:uiPriority="71"/>
+    <w:lsdException w:name="Colorful List Accent 3" w:uiPriority="72"/>
+    <w:lsdException w:name="Colorful Grid Accent 3" w:uiPriority="73"/>
+    <w:lsdException w:name="Light Shading Accent 4" w:uiPriority="60"/>
+    <w:lsdException w:name="Light List Accent 4" w:uiPriority="61"/>
+    <w:lsdException w:name="Light Grid Accent 4" w:uiPriority="62"/>
+    <w:lsdException w:name="Medium Shading 1 Accent 4" w:uiPriority="63"/>
+    <w:lsdException w:name="Medium Shading 2 Accent 4" w:uiPriority="64"/>
+    <w:lsdException w:name="Medium List 1 Accent 4" w:uiPriority="65"/>
+    <w:lsdException w:name="Medium List 2 Accent 4" w:uiPriority="66"/>
+    <w:lsdException w:name="Medium Grid 1 Accent 4" w:uiPriority="67"/>
+    <w:lsdException w:name="Medium Grid 2 Accent 4" w:uiPriority="68"/>
+    <w:lsdException w:name="Medium Grid 3 Accent 4" w:uiPriority="69"/>
+    <w:lsdException w:name="Dark List Accent 4" w:uiPriority="70"/>
+    <w:lsdException w:name="Colorful Shading Accent 4" w:uiPriority="71"/>
+    <w:lsdException w:name="Colorful List Accent 4" w:uiPriority="72"/>
+    <w:lsdException w:name="Colorful Grid Accent 4" w:uiPriority="73"/>
+    <w:lsdException w:name="Light Shading Accent 5" w:uiPriority="60"/>
+    <w:lsdException w:name="Light List Accent 5" w:uiPriority="61"/>
+    <w:lsdException w:name="Light Grid Accent 5" w:uiPriority="62"/>
+    <w:lsdException w:name="Medium Shading 1 Accent 5" w:uiPriority="63"/>
+    <w:lsdException w:name="Medium Shading 2 Accent 5" w:uiPriority="64"/>
+    <w:lsdException w:name="Medium List 1 Accent 5" w:uiPriority="65"/>
+    <w:lsdException w:name="Medium List 2 Accent 5" w:uiPriority="66"/>
+    <w:lsdException w:name="Medium Grid 1 Accent 5" w:uiPriority="67"/>
+    <w:lsdException w:name="Medium Grid 2 Accent 5" w:uiPriority="68"/>
+    <w:lsdException w:name="Medium Grid 3 Accent 5" w:uiPriority="69"/>
+    <w:lsdException w:name="Dark List Accent 5" w:uiPriority="70"/>
+    <w:lsdException w:name="Colorful Shading Accent 5" w:uiPriority="71"/>
+    <w:lsdException w:name="Colorful List Accent 5" w:uiPriority="72"/>
+    <w:lsdException w:name="Colorful Grid Accent 5" w:uiPriority="73"/>
+    <w:lsdException w:name="Light Shading Accent 6" w:uiPriority="60"/>
+    <w:lsdException w:name="Light List Accent 6" w:uiPriority="61"/>
+    <w:lsdException w:name="Light Grid Accent 6" w:uiPriority="62"/>
+    <w:lsdException w:name="Medium Shading 1 Accent 6" w:uiPriority="63"/>
+    <w:lsdException w:name="Medium Shading 2 Accent 6" w:uiPriority="64"/>
+    <w:lsdException w:name="Medium List 1 Accent 6" w:uiPriority="65"/>
+    <w:lsdException w:name="Medium List 2 Accent 6" w:uiPriority="66"/>
+    <w:lsdException w:name="Medium Grid 1 Accent 6" w:uiPriority="67"/>
+    <w:lsdException w:name="Medium Grid 2 Accent 6" w:uiPriority="68"/>
+    <w:lsdException w:name="Medium Grid 3 Accent 6" w:uiPriority="69"/>
+    <w:lsdException w:name="Dark List Accent 6" w:uiPriority="70"/>
+    <w:lsdException w:name="Colorful Shading Accent 6" w:uiPriority="71"/>
+    <w:lsdException w:name="Colorful List Accent 6" w:uiPriority="72"/>
+    <w:lsdException w:name="Colorful Grid Accent 6" w:uiPriority="73"/>
+    <w:lsdException w:name="Subtle Emphasis" w:uiPriority="19" w:qFormat="1"/>
+    <w:lsdException w:name="Intense Emphasis" w:uiPriority="21" w:qFormat="1"/>
+    <w:lsdException w:name="Subtle Reference" w:uiPriority="31" w:qFormat="1"/>
+    <w:lsdException w:name="Intense Reference" w:uiPriority="32" w:qFormat="1"/>
+    <w:lsdException w:name="Book Title" w:uiPriority="33" w:qFormat="1"/>
+    <w:lsdException w:name="Bibliography" w:semiHidden="1" w:uiPriority="37" w:unhideWhenUsed="1"/>
+    <w:lsdException w:name="TOC Heading" w:semiHidden="1" w:uiPriority="39" w:unhideWhenUsed="1" w:qFormat="1"/>
+    <w:lsdException w:name="Plain Table 1" w:uiPriority="41"/>
+    <w:lsdException w:name="Plain Table 2" w:uiPriority="42"/>
+    <w:lsdException w:name="Plain Table 3" w:uiPriority="43"/>
+    <w:lsdException w:name="Plain Table 4" w:uiPriority="44"/>
+    <w:lsdException w:name="Plain Table 5" w:uiPriority="45"/>
+    <w:lsdException w:name="Grid Table Light" w:uiPriority="40"/>
+    <w:lsdException w:name="Grid Table 1 Light" w:uiPriority="46"/>
+    <w:lsdException w:name="Grid Table 2" w:uiPriority="47"/>
+    <w:lsdException w:name="Grid Table 3" w:uiPriority="48"/>
+    <w:lsdException w:name="Grid Table 4" w:uiPriority="49"/>
+    <w:lsdException w:name="Grid Table 5 Dark" w:uiPriority="50"/>
+    <w:lsdException w:name="Grid Table 6 Colorful" w:uiPriority="51"/>
+    <w:lsdException w:name="Grid Table 7 Colorful" w:uiPriority="52"/>
+    <w:lsdException w:name="Grid Table 1 Light Accent 1" w:uiPriority="46"/>
+    <w:lsdException w:name="Grid Table 2 Accent 1" w:uiPriority="47"/>
+    <w:lsdException w:name="Grid Table 3 Accent 1" w:uiPriority="48"/>
+    <w:lsdException w:name="Grid Table 4 Accent 1" w:uiPriority="49"/>
+    <w:lsdException w:name="Grid Table 5 Dark Accent 1" w:uiPriority="50"/>
+    <w:lsdException w:name="Grid Table 6 Colorful Accent 1" w:uiPriority="51"/>
+    <w:lsdException w:name="Grid Table 7 Colorful Accent 1" w:uiPriority="52"/>
+    <w:lsdException w:name="Grid Table 1 Light Accent 2" w:uiPriority="46"/>
+    <w:lsdException w:name="Grid Table 2 Accent 2" w:uiPriority="47"/>
+    <w:lsdException w:name="Grid Table 3 Accent 2" w:uiPriority="48"/>
+    <w:lsdException w:name="Grid Table 4 Accent 2" w:uiPriority="49"/>
+    <w:lsdException w:name="Grid Table 5 Dark Accent 2" w:uiPriority="50"/>
+    <w:lsdException w:name="Grid Table 6 Colorful Accent 2" w:uiPriority="51"/>
+    <w:lsdException w:name="Grid Table 7 Colorful Accent 2" w:uiPriority="52"/>
+    <w:lsdException w:name="Grid Table 1 Light Accent 3" w:uiPriority="46"/>
+    <w:lsdException w:name="Grid Table 2 Accent 3" w:uiPriority="47"/>
+    <w:lsdException w:name="Grid Table 3 Accent 3" w:uiPriority="48"/>
+    <w:lsdException w:name="Grid Table 4 Accent 3" w:uiPriority="49"/>
+    <w:lsdException w:name="Grid Table 5 Dark Accent 3" w:uiPriority="50"/>
+    <w:lsdException w:name="Grid Table 6 Colorful Accent 3" w:uiPriority="51"/>
+    <w:lsdException w:name="Grid Table 7 Colorful Accent 3" w:uiPriority="52"/>
+    <w:lsdException w:name="Grid Table 1 Light Accent 4" w:uiPriority="46"/>
+    <w:lsdException w:name="Grid Table 2 Accent 4" w:uiPriority="47"/>
+    <w:lsdException w:name="Grid Table 3 Accent 4" w:uiPriority="48"/>
+    <w:lsdException w:name="Grid Table 4 Accent 4" w:uiPriority="49"/>
+    <w:lsdException w:name="Grid Table 5 Dark Accent 4" w:uiPriority="50"/>
+    <w:lsdException w:name="Grid Table 6 Colorful Accent 4" w:uiPriority="51"/>
+    <w:lsdException w:name="Grid Table 7 Colorful Accent 4" w:uiPriority="52"/>
+    <w:lsdException w:name="Grid Table 1 Light Accent 5" w:uiPriority="46"/>
+    <w:lsdException w:name="Grid Table 2 Accent 5" w:uiPriority="47"/>
+    <w:lsdException w:name="Grid Table 3 Accent 5" w:uiPriority="48"/>
+    <w:lsdException w:name="Grid Table 4 Accent 5" w:uiPriority="49"/>
+    <w:lsdException w:name="Grid Table 5 Dark Accent 5" w:uiPriority="50"/>
+    <w:lsdException w:name="Grid Table 6 Colorful Accent 5" w:uiPriority="51"/>
+    <w:lsdException w:name="Grid Table 7 Colorful Accent 5" w:uiPriority="52"/>
+    <w:lsdException w:name="Grid Table 1 Light Accent 6" w:uiPriority="46"/>
+    <w:lsdException w:name="Grid Table 2 Accent 6" w:uiPriority="47"/>
+    <w:lsdException w:name="Grid Table 3 Accent 6" w:uiPriority="48"/>
+    <w:lsdException w:name="Grid Table 4 Accent 6" w:uiPriority="49"/>
+    <w:lsdException w:name="Grid Table 5 Dark Accent 6" w:uiPriority="50"/>
+    <w:lsdException w:name="Grid Table 6 Colorful Accent 6" w:uiPriority="51"/>
+    <w:lsdException w:name="Grid Table 7 Colorful Accent 6" w:uiPriority="52"/>
+    <w:lsdException w:name="List Table 1 Light" w:uiPriority="46"/>
+    <w:lsdException w:name="List Table 2" w:uiPriority="47"/>
+    <w:lsdException w:name="List Table 3" w:uiPriority="48"/>
+    <w:lsdException w:name="List Table 4" w:uiPriority="49"/>
+    <w:lsdException w:name="List Table 5 Dark" w:uiPriority="50"/>
+    <w:lsdException w:name="List Table 6 Colorful" w:uiPriority="51"/>
+    <w:lsdException w:name="List Table 7 Colorful" w:uiPriority="52"/>
+    <w:lsdException w:name="List Table 1 Light Accent 1" w:uiPriority="46"/>
+    <w:lsdException w:name="List Table 2 Accent 1" w:uiPriority="47"/>
+    <w:lsdException w:name="List Table 3 Accent 1" w:uiPriority="48"/>
+    <w:lsdException w:name="List Table 4 Accent 1" w:uiPriority="49"/>
+    <w:lsdException w:name="List Table 5 Dark Accent 1" w:uiPriority="50"/>
+    <w:lsdException w:name="List Table 6 Colorful Accent 1" w:uiPriority="51"/>
+    <w:lsdException w:name="List Table 7 Colorful Accent 1" w:uiPriority="52"/>
+    <w:lsdException w:name="List Table 1 Light Accent 2" w:uiPriority="46"/>
+    <w:lsdException w:name="List Table 2 Accent 2" w:uiPriority="47"/>
+    <w:lsdException w:name="List Table 3 Accent 2" w:uiPriority="48"/>
+    <w:lsdException w:name="List Table 4 Accent 2" w:uiPriority="49"/>
+    <w:lsdException w:name="List Table 5 Dark Accent 2" w:uiPriority="50"/>
+    <w:lsdException w:name="List Table 6 Colorful Accent 2" w:uiPriority="51"/>
+    <w:lsdException w:name="List Table 7 Colorful Accent 2" w:uiPriority="52"/>
+    <w:lsdException w:name="List Table 1 Light Accent 3" w:uiPriority="46"/>
+    <w:lsdException w:name="List Table 2 Accent 3" w:uiPriority="47"/>
+    <w:lsdException w:name="List Table 3 Accent 3" w:uiPriority="48"/>
+    <w:lsdException w:name="List Table 4 Accent 3" w:uiPriority="49"/>
+    <w:lsdException w:name="List Table 5 Dark Accent 3" w:uiPriority="50"/>
+    <w:lsdException w:name="List Table 6 Colorful Accent 3" w:uiPriority="51"/>
+    <w:lsdException w:name="List Table 7 Colorful Accent 3" w:uiPriority="52"/>
+    <w:lsdException w:name="List Table 1 Light Accent 4" w:uiPriority="46"/>
+    <w:lsdException w:name="List Table 2 Accent 4" w:uiPriority="47"/>
+    <w:lsdException w:name="List Table 3 Accent 4" w:uiPriority="48"/>
+    <w:lsdException w:name="List Table 4 Accent 4" w:uiPriority="49"/>
+    <w:lsdException w:name="List Table 5 Dark Accent 4" w:uiPriority="50"/>
+    <w:lsdException w:name="List Table 6 Colorful Accent 4" w:uiPriority="51"/>
+    <w:lsdException w:name="List Table 7 Colorful Accent 4" w:uiPriority="52"/>
+    <w:lsdException w:name="List Table 1 Light Accent 5" w:uiPriority="46"/>
+    <w:lsdException w:name="List Table 2 Accent 5" w:uiPriority="47"/>
+    <w:lsdException w:name="List Table 3 Accent 5" w:uiPriority="48"/>
+    <w:lsdException w:name="List Table 4 Accent 5" w:uiPriority="49"/>
+    <w:lsdException w:name="List Table 5 Dark Accent 5" w:uiPriority="50"/>
+    <w:lsdException w:name="List Table 6 Colorful Accent 5" w:uiPriority="51"/>
+    <w:lsdException w:name="List Table 7 Colorful Accent 5" w:uiPriority="52"/>
+    <w:lsdException w:name="List Table 1 Light Accent 6" w:uiPriority="46"/>
+    <w:lsdException w:name="List Table 2 Accent 6" w:uiPriority="47"/>
+    <w:lsdException w:name="List Table 3 Accent 6" w:uiPriority="48"/>
+    <w:lsdException w:name="List Table 4 Accent 6" w:uiPriority="49"/>
+    <w:lsdException w:name="List Table 5 Dark Accent 6" w:uiPriority="50"/>
+    <w:lsdException w:name="List Table 6 Colorful Accent 6" w:uiPriority="51"/>
+    <w:lsdException w:name="List Table 7 Colorful Accent 6" w:uiPriority="52"/>
+    <w:lsdException w:name="Mention" w:semiHidden="1" w:unhideWhenUsed="1"/>
+    <w:lsdException w:name="Smart Hyperlink" w:semiHidden="1" w:unhideWhenUsed="1"/>
+    <w:lsdException w:name="Hashtag" w:semiHidden="1" w:unhideWhenUsed="1"/>
+    <w:lsdException w:name="Unresolved Mention" w:semiHidden="1" w:unhideWhenUsed="1"/>
+    <w:lsdException w:name="Smart Link" w:semiHidden="1" w:unhideWhenUsed="1"/>
+  </w:latentStyles>
+  <w:style w:type="paragraph" w:default="1" w:styleId="Normal">
     <w:name w:val="Normal"/>
     <w:qFormat/>
     <w:pPr>
-      <w:widowControl w:val="false"/>
-      <w:kinsoku w:val="true"/>
-      <w:overflowPunct w:val="true"/>
-      <w:autoSpaceDE w:val="true"/>
-      <w:bidi w:val="0"/>
-      <w:spacing w:lineRule="auto" w:line="240" w:before="0" w:after="0"/>
-      <w:ind w:left="0" w:right="0"/>
-      <w:jc w:val="left"/>
+      <w:widowControl w:val="0"/>
     </w:pPr>
     <w:rPr>
-      <w:rFonts w:ascii="Calibri" w:hAnsi="Calibri" w:eastAsia="Calibri" w:cs="Calibri"/>
-      <w:color w:val="auto"/>
-      <w:kern w:val="0"/>
-      <w:sz w:val="22"/>
-      <w:szCs w:val="22"/>
-      <w:lang w:val="en-US" w:eastAsia="en-US" w:bidi="ar-SA"/>
+      <w:rFonts w:cs="Calibri"/>
     </w:rPr>
   </w:style>
   <w:style w:type="paragraph" w:styleId="Heading1">
-    <w:name w:val="Heading 1"/>
+    <w:name w:val="heading 1"/>
     <w:basedOn w:val="Normal"/>
+    <w:uiPriority w:val="9"/>
     <w:qFormat/>
     <w:pPr>
-      <w:numPr>
-        <w:ilvl w:val="0"/>
-        <w:numId w:val="0"/>
-      </w:numPr>
-      <w:spacing w:before="19" w:after="0"/>
-      <w:ind w:hanging="279" w:left="499"/>
-      <w:outlineLvl w:val="1"/>
+      <w:spacing w:before="19"/>
+      <w:ind w:left="499" w:hanging="279"/>
+      <w:outlineLvl w:val="0"/>
     </w:pPr>
     <w:rPr>
-      <w:rFonts w:ascii="Calibri" w:hAnsi="Calibri" w:eastAsia="Calibri" w:cs="Calibri"/>
       <w:b/>
       <w:bCs/>
       <w:sz w:val="28"/>
       <w:szCs w:val="28"/>
-      <w:lang w:val="en-US" w:eastAsia="en-US" w:bidi="ar-SA"/>
     </w:rPr>
   </w:style>
   <w:style w:type="paragraph" w:styleId="Heading2">
-    <w:name w:val="Heading 2"/>
+    <w:name w:val="heading 2"/>
     <w:basedOn w:val="Normal"/>
+    <w:uiPriority w:val="9"/>
+    <w:semiHidden/>
+    <w:unhideWhenUsed/>
     <w:qFormat/>
     <w:pPr>
-      <w:numPr>
-        <w:ilvl w:val="0"/>
-        <w:numId w:val="0"/>
-      </w:numPr>
       <w:ind w:left="220"/>
+      <w:outlineLvl w:val="1"/>
+    </w:pPr>
+    <w:rPr>
+      <w:rFonts w:ascii="Times New Roman" w:eastAsia="Times New Roman" w:hAnsi="Times New Roman" w:cs="Times New Roman"/>
+      <w:sz w:val="28"/>
+      <w:szCs w:val="28"/>
+    </w:rPr>
+  </w:style>
+  <w:style w:type="paragraph" w:styleId="Heading3">
+    <w:name w:val="heading 3"/>
+    <w:basedOn w:val="Normal"/>
+    <w:uiPriority w:val="9"/>
+    <w:semiHidden/>
+    <w:unhideWhenUsed/>
+    <w:qFormat/>
+    <w:pPr>
+      <w:spacing w:before="235"/>
+      <w:ind w:left="577" w:hanging="357"/>
       <w:outlineLvl w:val="2"/>
     </w:pPr>
     <w:rPr>
-      <w:rFonts w:ascii="Times New Roman" w:hAnsi="Times New Roman" w:eastAsia="Times New Roman" w:cs="Times New Roman"/>
-      <w:sz w:val="28"/>
-      <w:szCs w:val="28"/>
-      <w:lang w:val="en-US" w:eastAsia="en-US" w:bidi="ar-SA"/>
-    </w:rPr>
-  </w:style>
-  <w:style w:type="paragraph" w:styleId="Heading3">
-    <w:name w:val="Heading 3"/>
-    <w:basedOn w:val="Normal"/>
-    <w:qFormat/>
-    <w:pPr>
-      <w:numPr>
-        <w:ilvl w:val="0"/>
-        <w:numId w:val="0"/>
-      </w:numPr>
-      <w:spacing w:before="235" w:after="0"/>
-      <w:ind w:hanging="357" w:left="577"/>
-      <w:outlineLvl w:val="3"/>
-    </w:pPr>
-    <w:rPr>
-      <w:rFonts w:ascii="Calibri" w:hAnsi="Calibri" w:eastAsia="Calibri" w:cs="Calibri"/>
       <w:b/>
       <w:bCs/>
       <w:sz w:val="24"/>
       <w:szCs w:val="24"/>
-      <w:lang w:val="en-US" w:eastAsia="en-US" w:bidi="ar-SA"/>
     </w:rPr>
   </w:style>
-  <w:style w:type="character" w:styleId="DefaultParagraphFont">
+  <w:style w:type="character" w:default="1" w:styleId="DefaultParagraphFont">
     <w:name w:val="Default Paragraph Font"/>
-    <w:qFormat/>
-    <w:rPr/>
+    <w:uiPriority w:val="1"/>
+    <w:semiHidden/>
+    <w:unhideWhenUsed/>
   </w:style>
-  <w:style w:type="paragraph" w:styleId="Heading">
+  <w:style w:type="table" w:default="1" w:styleId="TableNormal">
+    <w:name w:val="Normal Table"/>
+    <w:uiPriority w:val="99"/>
+    <w:semiHidden/>
+    <w:unhideWhenUsed/>
+    <w:tblPr>
+      <w:tblInd w:w="0" w:type="dxa"/>
+      <w:tblCellMar>
+        <w:top w:w="0" w:type="dxa"/>
+        <w:left w:w="108" w:type="dxa"/>
+        <w:bottom w:w="0" w:type="dxa"/>
+        <w:right w:w="108" w:type="dxa"/>
+      </w:tblCellMar>
+    </w:tblPr>
+  </w:style>
+  <w:style w:type="numbering" w:default="1" w:styleId="NoList">
+    <w:name w:val="No List"/>
+    <w:uiPriority w:val="99"/>
+    <w:semiHidden/>
+    <w:unhideWhenUsed/>
+  </w:style>
+  <w:style w:type="paragraph" w:customStyle="1" w:styleId="Heading">
     <w:name w:val="Heading"/>
     <w:basedOn w:val="Normal"/>
     <w:next w:val="BodyText"/>
     <w:qFormat/>
     <w:pPr>
-      <w:keepNext w:val="true"/>
+      <w:keepNext/>
       <w:spacing w:before="240" w:after="120"/>
     </w:pPr>
     <w:rPr>
-      <w:rFonts w:ascii="Liberation Sans" w:hAnsi="Liberation Sans" w:eastAsia="Noto Sans CJK SC" w:cs="Noto Sans Devanagari"/>
+      <w:rFonts w:ascii="Liberation Sans" w:eastAsia="Noto Sans CJK SC" w:hAnsi="Liberation Sans" w:cs="Noto Sans Devanagari"/>
       <w:sz w:val="28"/>
       <w:szCs w:val="28"/>
     </w:rPr>
@@ -3583,24 +4157,16 @@
   <w:style w:type="paragraph" w:styleId="BodyText">
     <w:name w:val="Body Text"/>
     <w:basedOn w:val="Normal"/>
-    <w:pPr/>
-    <w:rPr>
-      <w:rFonts w:ascii="Calibri" w:hAnsi="Calibri" w:eastAsia="Calibri" w:cs="Calibri"/>
-      <w:sz w:val="22"/>
-      <w:szCs w:val="22"/>
-      <w:lang w:val="en-US" w:eastAsia="en-US" w:bidi="ar-SA"/>
-    </w:rPr>
   </w:style>
   <w:style w:type="paragraph" w:styleId="List">
     <w:name w:val="List"/>
     <w:basedOn w:val="BodyText"/>
-    <w:pPr/>
     <w:rPr>
       <w:rFonts w:cs="Noto Sans Devanagari"/>
     </w:rPr>
   </w:style>
   <w:style w:type="paragraph" w:styleId="Caption">
-    <w:name w:val="Caption"/>
+    <w:name w:val="caption"/>
     <w:basedOn w:val="Normal"/>
     <w:qFormat/>
     <w:pPr>
@@ -3615,7 +4181,7 @@
       <w:szCs w:val="24"/>
     </w:rPr>
   </w:style>
-  <w:style w:type="paragraph" w:styleId="Index">
+  <w:style w:type="paragraph" w:customStyle="1" w:styleId="Index">
     <w:name w:val="Index"/>
     <w:basedOn w:val="Normal"/>
     <w:qFormat/>
@@ -3631,96 +4197,78 @@
     <w:basedOn w:val="Normal"/>
     <w:qFormat/>
     <w:pPr>
-      <w:ind w:hanging="357" w:left="577"/>
+      <w:ind w:left="577" w:hanging="357"/>
     </w:pPr>
-    <w:rPr>
-      <w:rFonts w:ascii="Calibri" w:hAnsi="Calibri" w:eastAsia="Calibri" w:cs="Calibri"/>
-      <w:lang w:val="en-US" w:eastAsia="en-US" w:bidi="ar-SA"/>
-    </w:rPr>
   </w:style>
-  <w:style w:type="paragraph" w:styleId="TableParagraph">
+  <w:style w:type="paragraph" w:customStyle="1" w:styleId="TableParagraph">
     <w:name w:val="Table Paragraph"/>
     <w:basedOn w:val="Normal"/>
     <w:qFormat/>
-    <w:pPr/>
     <w:rPr>
-      <w:rFonts w:ascii="Consolas" w:hAnsi="Consolas" w:eastAsia="Consolas" w:cs="Consolas"/>
-      <w:lang w:val="en-US" w:eastAsia="en-US" w:bidi="ar-SA"/>
+      <w:rFonts w:ascii="Consolas" w:eastAsia="Consolas" w:hAnsi="Consolas" w:cs="Consolas"/>
     </w:rPr>
   </w:style>
-  <w:style w:type="paragraph" w:styleId="FrameContents">
+  <w:style w:type="paragraph" w:customStyle="1" w:styleId="FrameContents">
     <w:name w:val="Frame Contents"/>
     <w:basedOn w:val="Normal"/>
     <w:qFormat/>
-    <w:pPr/>
-    <w:rPr/>
   </w:style>
-  <w:style w:type="paragraph" w:styleId="HeaderandFooter">
+  <w:style w:type="paragraph" w:customStyle="1" w:styleId="HeaderandFooter">
     <w:name w:val="Header and Footer"/>
     <w:basedOn w:val="Normal"/>
     <w:qFormat/>
-    <w:pPr/>
-    <w:rPr/>
   </w:style>
   <w:style w:type="paragraph" w:styleId="Footer">
-    <w:name w:val="Footer"/>
+    <w:name w:val="footer"/>
     <w:basedOn w:val="HeaderandFooter"/>
-    <w:pPr/>
-    <w:rPr/>
   </w:style>
-  <w:style w:type="paragraph" w:styleId="TableContents">
+  <w:style w:type="paragraph" w:customStyle="1" w:styleId="TableContents">
     <w:name w:val="Table Contents"/>
     <w:basedOn w:val="Normal"/>
     <w:qFormat/>
     <w:pPr>
-      <w:widowControl w:val="false"/>
       <w:suppressLineNumbers/>
     </w:pPr>
-    <w:rPr/>
-  </w:style>
-  <w:style w:type="numbering" w:styleId="NoList">
-    <w:name w:val="No List"/>
-    <w:qFormat/>
   </w:style>
 </w:styles>
 </file>
 
 <file path=word/theme/theme1.xml><?xml version="1.0" encoding="utf-8"?>
-<a:theme xmlns:a="http://schemas.openxmlformats.org/drawingml/2006/main" xmlns:r="http://schemas.openxmlformats.org/officeDocument/2006/relationships" name="Office Theme">
+<a:theme xmlns:a="http://schemas.openxmlformats.org/drawingml/2006/main" name="Office Theme">
   <a:themeElements>
     <a:clrScheme name="Office">
       <a:dk1>
         <a:srgbClr val="000000"/>
       </a:dk1>
       <a:lt1>
-        <a:srgbClr val="ffffff"/>
+        <a:srgbClr val="FFFFFF"/>
       </a:lt1>
       <a:dk2>
-        <a:srgbClr val="1f497d"/>
+        <a:srgbClr val="1F497D"/>
       </a:dk2>
       <a:lt2>
-        <a:srgbClr val="eeece1"/>
+        <a:srgbClr val="EEECE1"/>
       </a:lt2>
       <a:accent1>
-        <a:srgbClr val="4f81bd"/>
+        <a:srgbClr val="4F81BD"/>
       </a:accent1>
       <a:accent2>
-        <a:srgbClr val="c0504d"/>
+        <a:srgbClr val="C0504D"/>
       </a:accent2>
       <a:accent3>
-        <a:srgbClr val="9bbb59"/>
+        <a:srgbClr val="9BBB59"/>
       </a:accent3>
       <a:accent4>
-        <a:srgbClr val="8064a2"/>
+        <a:srgbClr val="8064A2"/>
       </a:accent4>
       <a:accent5>
-        <a:srgbClr val="4bacc6"/>
+        <a:srgbClr val="4BACC6"/>
       </a:accent5>
       <a:accent6>
-        <a:srgbClr val="f79646"/>
+        <a:srgbClr val="F79646"/>
       </a:accent6>
       <a:hlink>
-        <a:srgbClr val="0000ff"/>
+        <a:srgbClr val="0000FF"/>
       </a:hlink>
       <a:folHlink>
         <a:srgbClr val="800080"/>
@@ -3728,14 +4276,14 @@
     </a:clrScheme>
     <a:fontScheme name="Office">
       <a:majorFont>
-        <a:latin typeface="Arial" pitchFamily="0" charset="1"/>
-        <a:ea typeface="DejaVu Sans" pitchFamily="0" charset="1"/>
-        <a:cs typeface="DejaVu Sans" pitchFamily="0" charset="1"/>
+        <a:latin typeface="Arial"/>
+        <a:ea typeface="DejaVu Sans"/>
+        <a:cs typeface="DejaVu Sans"/>
       </a:majorFont>
       <a:minorFont>
-        <a:latin typeface="Arial" pitchFamily="0" charset="1"/>
-        <a:ea typeface="DejaVu Sans" pitchFamily="0" charset="1"/>
-        <a:cs typeface="DejaVu Sans" pitchFamily="0" charset="1"/>
+        <a:latin typeface="Arial"/>
+        <a:ea typeface="DejaVu Sans"/>
+        <a:cs typeface="DejaVu Sans"/>
       </a:minorFont>
     </a:fontScheme>
     <a:fmtScheme>
@@ -3788,5 +4336,7 @@
       </a:bgFillStyleLst>
     </a:fmtScheme>
   </a:themeElements>
+  <a:objectDefaults/>
+  <a:extraClrSchemeLst/>
 </a:theme>
 </file>
</xml_diff>